<commit_message>
feat: update Word procedure v3.1 with manuscript corrections and visual flowcharts
</commit_message>
<xml_diff>
--- a/public/Procedimiento_Mantenimiento_ISO9001.docx
+++ b/public/Procedimiento_Mantenimiento_ISO9001.docx
@@ -29,7 +29,7 @@
           <w:color w:val="475569"/>
           <w:sz w:val="22"/>
         </w:rPr>
-        <w:t>Mantenimiento Preventivo y Correctivo de Flota de Vehículos y Maquinarias</w:t>
+        <w:t>Mantenimiento Preventivo, Correctivo y Herrería de Flota de Vehículos y Maquinarias</w:t>
         <w:br/>
         <w:t>Contenedores Hugo S.A. — Bajo Norma ISO 9001:2015</w:t>
       </w:r>
@@ -41,15 +41,15 @@
         <w:tblLook w:firstColumn="1" w:firstRow="1" w:lastColumn="0" w:lastRow="0" w:noHBand="0" w:noVBand="1" w:val="04A0"/>
       </w:tblPr>
       <w:tblGrid>
-        <w:gridCol w:w="2340"/>
-        <w:gridCol w:w="2340"/>
-        <w:gridCol w:w="2340"/>
-        <w:gridCol w:w="2340"/>
+        <w:gridCol w:w="2484"/>
+        <w:gridCol w:w="2484"/>
+        <w:gridCol w:w="2484"/>
+        <w:gridCol w:w="2484"/>
       </w:tblGrid>
       <w:tr>
         <w:tc>
           <w:tcPr>
-            <w:tcW w:type="dxa" w:w="2340"/>
+            <w:tcW w:type="dxa" w:w="2484"/>
             <w:shd w:fill="F1F5F9"/>
             <w:tcMar>
               <w:top w:w="80" w:type="dxa"/>
@@ -75,7 +75,7 @@
         </w:tc>
         <w:tc>
           <w:tcPr>
-            <w:tcW w:type="dxa" w:w="2340"/>
+            <w:tcW w:type="dxa" w:w="2484"/>
             <w:shd w:fill="F1F5F9"/>
             <w:tcMar>
               <w:top w:w="80" w:type="dxa"/>
@@ -101,7 +101,7 @@
         </w:tc>
         <w:tc>
           <w:tcPr>
-            <w:tcW w:type="dxa" w:w="2340"/>
+            <w:tcW w:type="dxa" w:w="2484"/>
             <w:shd w:fill="F1F5F9"/>
             <w:tcMar>
               <w:top w:w="80" w:type="dxa"/>
@@ -127,7 +127,7 @@
         </w:tc>
         <w:tc>
           <w:tcPr>
-            <w:tcW w:type="dxa" w:w="2340"/>
+            <w:tcW w:type="dxa" w:w="2484"/>
             <w:shd w:fill="F1F5F9"/>
             <w:tcMar>
               <w:top w:w="80" w:type="dxa"/>
@@ -147,7 +147,7 @@
                 <w:color w:val="0F172A"/>
                 <w:sz w:val="19"/>
               </w:rPr>
-              <w:t>3.0</w:t>
+              <w:t>3.1 (Actualizada)</w:t>
             </w:r>
           </w:p>
         </w:tc>
@@ -155,7 +155,7 @@
       <w:tr>
         <w:tc>
           <w:tcPr>
-            <w:tcW w:type="dxa" w:w="2340"/>
+            <w:tcW w:type="dxa" w:w="2484"/>
             <w:shd w:fill="F1F5F9"/>
             <w:tcMar>
               <w:top w:w="80" w:type="dxa"/>
@@ -181,7 +181,7 @@
         </w:tc>
         <w:tc>
           <w:tcPr>
-            <w:tcW w:type="dxa" w:w="2340"/>
+            <w:tcW w:type="dxa" w:w="2484"/>
             <w:shd w:fill="F1F5F9"/>
             <w:tcMar>
               <w:top w:w="80" w:type="dxa"/>
@@ -207,7 +207,7 @@
         </w:tc>
         <w:tc>
           <w:tcPr>
-            <w:tcW w:type="dxa" w:w="2340"/>
+            <w:tcW w:type="dxa" w:w="2484"/>
             <w:shd w:fill="F1F5F9"/>
             <w:tcMar>
               <w:top w:w="80" w:type="dxa"/>
@@ -233,7 +233,7 @@
         </w:tc>
         <w:tc>
           <w:tcPr>
-            <w:tcW w:type="dxa" w:w="2340"/>
+            <w:tcW w:type="dxa" w:w="2484"/>
             <w:shd w:fill="F1F5F9"/>
             <w:tcMar>
               <w:top w:w="80" w:type="dxa"/>
@@ -303,7 +303,7 @@
           <w:rFonts w:ascii="Calibri" w:hAnsi="Calibri"/>
           <w:sz w:val="21"/>
         </w:rPr>
-        <w:t>Garantizar la disponibilidad operativa, confiabilidad y seguridad de la flota de la empresa mediante un sistema estructurado de mantenimiento preventivo y correctivo, asegurando la trazabilidad total de tareas, tiempos, insumos y sincronización oficial bajo los requisitos de la norma ISO 9001:2015.</w:t>
+        <w:t>Garantizar la disponibilidad operativa, confiabilidad y seguridad de la flota de la empresa mediante un sistema estructurado de mantenimiento preventivo, correctivo y de herrería, asegurando la trazabilidad total de tareas, tiempos, insumos y sincronización oficial bajo los requisitos de la norma ISO 9001:2015.</w:t>
       </w:r>
     </w:p>
     <w:p>
@@ -330,7 +330,7 @@
           <w:rFonts w:ascii="Calibri" w:hAnsi="Calibri"/>
           <w:sz w:val="21"/>
         </w:rPr>
-        <w:t>Aplica a todas las unidades de la empresa (Camiones, Camionetas, Autos, Auto-elevadores y Maquinarias) y a todo el personal involucrado (Conductores, Choferes, Mecánicos, Pañoleros, Jefes de Taller y Auditores).</w:t>
+        <w:t>Aplica a todas las unidades de la empresa (Camiones, Camionetas, Autos, Auto-elevadores y Maquinarias) y a todo el personal involucrado (Conductores, Choferes, Mecánicos, Supervisores, Jefes de Taller, Asistente IA y Auditores Internos).</w:t>
       </w:r>
     </w:p>
     <w:p>
@@ -367,15 +367,15 @@
         <w:tblLook w:firstColumn="1" w:firstRow="1" w:lastColumn="0" w:lastRow="0" w:noHBand="0" w:noVBand="1" w:val="04A0"/>
       </w:tblPr>
       <w:tblGrid>
-        <w:gridCol w:w="2340"/>
-        <w:gridCol w:w="2340"/>
-        <w:gridCol w:w="2340"/>
-        <w:gridCol w:w="2340"/>
+        <w:gridCol w:w="2484"/>
+        <w:gridCol w:w="2484"/>
+        <w:gridCol w:w="2484"/>
+        <w:gridCol w:w="2484"/>
       </w:tblGrid>
       <w:tr>
         <w:tc>
           <w:tcPr>
-            <w:tcW w:type="dxa" w:w="2340"/>
+            <w:tcW w:type="dxa" w:w="2484"/>
             <w:shd w:fill="1E3A8A"/>
             <w:tcMar>
               <w:top w:w="90" w:type="dxa"/>
@@ -398,7 +398,7 @@
         </w:tc>
         <w:tc>
           <w:tcPr>
-            <w:tcW w:type="dxa" w:w="2340"/>
+            <w:tcW w:type="dxa" w:w="2484"/>
             <w:shd w:fill="1E3A8A"/>
             <w:tcMar>
               <w:top w:w="90" w:type="dxa"/>
@@ -421,7 +421,7 @@
         </w:tc>
         <w:tc>
           <w:tcPr>
-            <w:tcW w:type="dxa" w:w="2340"/>
+            <w:tcW w:type="dxa" w:w="2484"/>
             <w:shd w:fill="1E3A8A"/>
             <w:tcMar>
               <w:top w:w="90" w:type="dxa"/>
@@ -444,7 +444,7 @@
         </w:tc>
         <w:tc>
           <w:tcPr>
-            <w:tcW w:type="dxa" w:w="2340"/>
+            <w:tcW w:type="dxa" w:w="2484"/>
             <w:shd w:fill="1E3A8A"/>
             <w:tcMar>
               <w:top w:w="90" w:type="dxa"/>
@@ -469,7 +469,7 @@
       <w:tr>
         <w:tc>
           <w:tcPr>
-            <w:tcW w:type="dxa" w:w="2340"/>
+            <w:tcW w:type="dxa" w:w="2484"/>
             <w:shd w:fill="F8FAFC"/>
             <w:tcMar>
               <w:top w:w="70" w:type="dxa"/>
@@ -491,7 +491,7 @@
         </w:tc>
         <w:tc>
           <w:tcPr>
-            <w:tcW w:type="dxa" w:w="2340"/>
+            <w:tcW w:type="dxa" w:w="2484"/>
             <w:shd w:fill="F8FAFC"/>
             <w:tcMar>
               <w:top w:w="70" w:type="dxa"/>
@@ -512,7 +512,7 @@
         </w:tc>
         <w:tc>
           <w:tcPr>
-            <w:tcW w:type="dxa" w:w="2340"/>
+            <w:tcW w:type="dxa" w:w="2484"/>
             <w:shd w:fill="F8FAFC"/>
             <w:tcMar>
               <w:top w:w="70" w:type="dxa"/>
@@ -535,7 +535,7 @@
         </w:tc>
         <w:tc>
           <w:tcPr>
-            <w:tcW w:type="dxa" w:w="2340"/>
+            <w:tcW w:type="dxa" w:w="2484"/>
             <w:shd w:fill="F8FAFC"/>
             <w:tcMar>
               <w:top w:w="70" w:type="dxa"/>
@@ -550,7 +550,7 @@
                 <w:rFonts w:ascii="Calibri" w:hAnsi="Calibri"/>
                 <w:sz w:val="18"/>
               </w:rPr>
-              <w:t>Pañol, Mecánicos, Jefes de Taller</w:t>
+              <w:t>Supervisores, Mecánicos, Jefes de Taller</w:t>
             </w:r>
           </w:p>
         </w:tc>
@@ -558,7 +558,7 @@
       <w:tr>
         <w:tc>
           <w:tcPr>
-            <w:tcW w:type="dxa" w:w="2340"/>
+            <w:tcW w:type="dxa" w:w="2484"/>
             <w:shd w:fill="FFFFFF"/>
             <w:tcMar>
               <w:top w:w="70" w:type="dxa"/>
@@ -580,7 +580,7 @@
         </w:tc>
         <w:tc>
           <w:tcPr>
-            <w:tcW w:type="dxa" w:w="2340"/>
+            <w:tcW w:type="dxa" w:w="2484"/>
             <w:shd w:fill="FFFFFF"/>
             <w:tcMar>
               <w:top w:w="70" w:type="dxa"/>
@@ -601,7 +601,7 @@
         </w:tc>
         <w:tc>
           <w:tcPr>
-            <w:tcW w:type="dxa" w:w="2340"/>
+            <w:tcW w:type="dxa" w:w="2484"/>
             <w:shd w:fill="FFFFFF"/>
             <w:tcMar>
               <w:top w:w="70" w:type="dxa"/>
@@ -624,7 +624,7 @@
         </w:tc>
         <w:tc>
           <w:tcPr>
-            <w:tcW w:type="dxa" w:w="2340"/>
+            <w:tcW w:type="dxa" w:w="2484"/>
             <w:shd w:fill="FFFFFF"/>
             <w:tcMar>
               <w:top w:w="70" w:type="dxa"/>
@@ -639,7 +639,7 @@
                 <w:rFonts w:ascii="Calibri" w:hAnsi="Calibri"/>
                 <w:sz w:val="18"/>
               </w:rPr>
-              <w:t>Sincronizador Automático (Puppeteer Worker)</w:t>
+              <w:t>Sincronizador Automático (ASISTENTE IA - Puppeteer Worker)</w:t>
             </w:r>
           </w:p>
         </w:tc>
@@ -647,7 +647,7 @@
       <w:tr>
         <w:tc>
           <w:tcPr>
-            <w:tcW w:type="dxa" w:w="2340"/>
+            <w:tcW w:type="dxa" w:w="2484"/>
             <w:shd w:fill="F8FAFC"/>
             <w:tcMar>
               <w:top w:w="70" w:type="dxa"/>
@@ -669,7 +669,7 @@
         </w:tc>
         <w:tc>
           <w:tcPr>
-            <w:tcW w:type="dxa" w:w="2340"/>
+            <w:tcW w:type="dxa" w:w="2484"/>
             <w:shd w:fill="F8FAFC"/>
             <w:tcMar>
               <w:top w:w="70" w:type="dxa"/>
@@ -690,7 +690,7 @@
         </w:tc>
         <w:tc>
           <w:tcPr>
-            <w:tcW w:type="dxa" w:w="2340"/>
+            <w:tcW w:type="dxa" w:w="2484"/>
             <w:shd w:fill="F8FAFC"/>
             <w:tcMar>
               <w:top w:w="70" w:type="dxa"/>
@@ -711,7 +711,7 @@
         </w:tc>
         <w:tc>
           <w:tcPr>
-            <w:tcW w:type="dxa" w:w="2340"/>
+            <w:tcW w:type="dxa" w:w="2484"/>
             <w:shd w:fill="F8FAFC"/>
             <w:tcMar>
               <w:top w:w="70" w:type="dxa"/>
@@ -726,7 +726,7 @@
                 <w:rFonts w:ascii="Calibri" w:hAnsi="Calibri"/>
                 <w:sz w:val="18"/>
               </w:rPr>
-              <w:t>Choferes, Mecánicos, Jefes</w:t>
+              <w:t>Choferes, Mecánicos, Jefes y Supervisores</w:t>
             </w:r>
           </w:p>
         </w:tc>
@@ -734,7 +734,7 @@
       <w:tr>
         <w:tc>
           <w:tcPr>
-            <w:tcW w:type="dxa" w:w="2340"/>
+            <w:tcW w:type="dxa" w:w="2484"/>
             <w:shd w:fill="FFFFFF"/>
             <w:tcMar>
               <w:top w:w="70" w:type="dxa"/>
@@ -756,7 +756,7 @@
         </w:tc>
         <w:tc>
           <w:tcPr>
-            <w:tcW w:type="dxa" w:w="2340"/>
+            <w:tcW w:type="dxa" w:w="2484"/>
             <w:shd w:fill="FFFFFF"/>
             <w:tcMar>
               <w:top w:w="70" w:type="dxa"/>
@@ -777,7 +777,7 @@
         </w:tc>
         <w:tc>
           <w:tcPr>
-            <w:tcW w:type="dxa" w:w="2340"/>
+            <w:tcW w:type="dxa" w:w="2484"/>
             <w:shd w:fill="FFFFFF"/>
             <w:tcMar>
               <w:top w:w="70" w:type="dxa"/>
@@ -800,7 +800,7 @@
         </w:tc>
         <w:tc>
           <w:tcPr>
-            <w:tcW w:type="dxa" w:w="2340"/>
+            <w:tcW w:type="dxa" w:w="2484"/>
             <w:shd w:fill="FFFFFF"/>
             <w:tcMar>
               <w:top w:w="70" w:type="dxa"/>
@@ -815,7 +815,7 @@
                 <w:rFonts w:ascii="Calibri" w:hAnsi="Calibri"/>
                 <w:sz w:val="18"/>
               </w:rPr>
-              <w:t>Gerencia, Jefatura de Taller, Auditores</w:t>
+              <w:t>Gerencia, Jefatura de Taller, Auditores, Supervisores</w:t>
             </w:r>
           </w:p>
         </w:tc>
@@ -848,14 +848,14 @@
         <w:tblLook w:firstColumn="1" w:firstRow="1" w:lastColumn="0" w:lastRow="0" w:noHBand="0" w:noVBand="1" w:val="04A0"/>
       </w:tblPr>
       <w:tblGrid>
-        <w:gridCol w:w="3120"/>
-        <w:gridCol w:w="3120"/>
-        <w:gridCol w:w="3120"/>
+        <w:gridCol w:w="3312"/>
+        <w:gridCol w:w="3312"/>
+        <w:gridCol w:w="3312"/>
       </w:tblGrid>
       <w:tr>
         <w:tc>
           <w:tcPr>
-            <w:tcW w:type="dxa" w:w="3120"/>
+            <w:tcW w:type="dxa" w:w="3312"/>
             <w:shd w:fill="0F172A"/>
             <w:tcMar>
               <w:top w:w="90" w:type="dxa"/>
@@ -878,7 +878,7 @@
         </w:tc>
         <w:tc>
           <w:tcPr>
-            <w:tcW w:type="dxa" w:w="3120"/>
+            <w:tcW w:type="dxa" w:w="3312"/>
             <w:shd w:fill="0F172A"/>
             <w:tcMar>
               <w:top w:w="90" w:type="dxa"/>
@@ -901,7 +901,7 @@
         </w:tc>
         <w:tc>
           <w:tcPr>
-            <w:tcW w:type="dxa" w:w="3120"/>
+            <w:tcW w:type="dxa" w:w="3312"/>
             <w:shd w:fill="0F172A"/>
             <w:tcMar>
               <w:top w:w="90" w:type="dxa"/>
@@ -926,7 +926,7 @@
       <w:tr>
         <w:tc>
           <w:tcPr>
-            <w:tcW w:type="dxa" w:w="3120"/>
+            <w:tcW w:type="dxa" w:w="3312"/>
             <w:shd w:fill="F1F5F9"/>
             <w:tcMar>
               <w:top w:w="70" w:type="dxa"/>
@@ -948,7 +948,7 @@
         </w:tc>
         <w:tc>
           <w:tcPr>
-            <w:tcW w:type="dxa" w:w="3120"/>
+            <w:tcW w:type="dxa" w:w="3312"/>
             <w:shd w:fill="F1F5F9"/>
             <w:tcMar>
               <w:top w:w="70" w:type="dxa"/>
@@ -969,7 +969,7 @@
         </w:tc>
         <w:tc>
           <w:tcPr>
-            <w:tcW w:type="dxa" w:w="3120"/>
+            <w:tcW w:type="dxa" w:w="3312"/>
             <w:shd w:fill="F1F5F9"/>
             <w:tcMar>
               <w:top w:w="70" w:type="dxa"/>
@@ -984,7 +984,7 @@
                 <w:rFonts w:ascii="Calibri" w:hAnsi="Calibri"/>
                 <w:sz w:val="18"/>
               </w:rPr>
-              <w:t>Plan de mantenimiento preventivo programado según kilometraje/horas de uso por unidad.</w:t>
+              <w:t>Plan de mantenimiento preventivo programado según unidad: Kilómetros / Litros de Combustible / Horas de uso por unidad.</w:t>
             </w:r>
           </w:p>
         </w:tc>
@@ -992,7 +992,7 @@
       <w:tr>
         <w:tc>
           <w:tcPr>
-            <w:tcW w:type="dxa" w:w="3120"/>
+            <w:tcW w:type="dxa" w:w="3312"/>
             <w:shd w:fill="FFFFFF"/>
             <w:tcMar>
               <w:top w:w="70" w:type="dxa"/>
@@ -1014,7 +1014,7 @@
         </w:tc>
         <w:tc>
           <w:tcPr>
-            <w:tcW w:type="dxa" w:w="3120"/>
+            <w:tcW w:type="dxa" w:w="3312"/>
             <w:shd w:fill="FFFFFF"/>
             <w:tcMar>
               <w:top w:w="70" w:type="dxa"/>
@@ -1035,7 +1035,7 @@
         </w:tc>
         <w:tc>
           <w:tcPr>
-            <w:tcW w:type="dxa" w:w="3120"/>
+            <w:tcW w:type="dxa" w:w="3312"/>
             <w:shd w:fill="FFFFFF"/>
             <w:tcMar>
               <w:top w:w="70" w:type="dxa"/>
@@ -1050,7 +1050,7 @@
                 <w:rFonts w:ascii="Calibri" w:hAnsi="Calibri"/>
                 <w:sz w:val="18"/>
               </w:rPr>
-              <w:t>Creación obligatoria de OT en la App Nativa con clasificación (Preventivo / Correctivo) y responsable asignado.</w:t>
+              <w:t>Creación obligatoria de OT en la App Nativa con clasificación (Preventivo / Correctivo / Herrería) y responsable asignado.</w:t>
             </w:r>
           </w:p>
         </w:tc>
@@ -1058,7 +1058,7 @@
       <w:tr>
         <w:tc>
           <w:tcPr>
-            <w:tcW w:type="dxa" w:w="3120"/>
+            <w:tcW w:type="dxa" w:w="3312"/>
             <w:shd w:fill="F1F5F9"/>
             <w:tcMar>
               <w:top w:w="70" w:type="dxa"/>
@@ -1080,7 +1080,7 @@
         </w:tc>
         <w:tc>
           <w:tcPr>
-            <w:tcW w:type="dxa" w:w="3120"/>
+            <w:tcW w:type="dxa" w:w="3312"/>
             <w:shd w:fill="F1F5F9"/>
             <w:tcMar>
               <w:top w:w="70" w:type="dxa"/>
@@ -1101,7 +1101,7 @@
         </w:tc>
         <w:tc>
           <w:tcPr>
-            <w:tcW w:type="dxa" w:w="3120"/>
+            <w:tcW w:type="dxa" w:w="3312"/>
             <w:shd w:fill="F1F5F9"/>
             <w:tcMar>
               <w:top w:w="70" w:type="dxa"/>
@@ -1116,7 +1116,7 @@
                 <w:rFonts w:ascii="Calibri" w:hAnsi="Calibri"/>
                 <w:sz w:val="18"/>
               </w:rPr>
-              <w:t>Registro de tiempo real (cronómetro), insumos utilizados y validación por controlador previo al cierre.</w:t>
+              <w:t>Registro de tiempo real (cronómetro), insumos utilizados y validación por Supervisor previo al cierre.</w:t>
             </w:r>
           </w:p>
         </w:tc>
@@ -1124,7 +1124,7 @@
       <w:tr>
         <w:tc>
           <w:tcPr>
-            <w:tcW w:type="dxa" w:w="3120"/>
+            <w:tcW w:type="dxa" w:w="3312"/>
             <w:shd w:fill="FFFFFF"/>
             <w:tcMar>
               <w:top w:w="70" w:type="dxa"/>
@@ -1146,7 +1146,7 @@
         </w:tc>
         <w:tc>
           <w:tcPr>
-            <w:tcW w:type="dxa" w:w="3120"/>
+            <w:tcW w:type="dxa" w:w="3312"/>
             <w:shd w:fill="FFFFFF"/>
             <w:tcMar>
               <w:top w:w="70" w:type="dxa"/>
@@ -1167,7 +1167,7 @@
         </w:tc>
         <w:tc>
           <w:tcPr>
-            <w:tcW w:type="dxa" w:w="3120"/>
+            <w:tcW w:type="dxa" w:w="3312"/>
             <w:shd w:fill="FFFFFF"/>
             <w:tcMar>
               <w:top w:w="70" w:type="dxa"/>
@@ -1190,7 +1190,7 @@
       <w:tr>
         <w:tc>
           <w:tcPr>
-            <w:tcW w:type="dxa" w:w="3120"/>
+            <w:tcW w:type="dxa" w:w="3312"/>
             <w:shd w:fill="F1F5F9"/>
             <w:tcMar>
               <w:top w:w="70" w:type="dxa"/>
@@ -1212,7 +1212,7 @@
         </w:tc>
         <w:tc>
           <w:tcPr>
-            <w:tcW w:type="dxa" w:w="3120"/>
+            <w:tcW w:type="dxa" w:w="3312"/>
             <w:shd w:fill="F1F5F9"/>
             <w:tcMar>
               <w:top w:w="70" w:type="dxa"/>
@@ -1233,7 +1233,7 @@
         </w:tc>
         <w:tc>
           <w:tcPr>
-            <w:tcW w:type="dxa" w:w="3120"/>
+            <w:tcW w:type="dxa" w:w="3312"/>
             <w:shd w:fill="F1F5F9"/>
             <w:tcMar>
               <w:top w:w="70" w:type="dxa"/>
@@ -1256,7 +1256,7 @@
       <w:tr>
         <w:tc>
           <w:tcPr>
-            <w:tcW w:type="dxa" w:w="3120"/>
+            <w:tcW w:type="dxa" w:w="3312"/>
             <w:shd w:fill="FFFFFF"/>
             <w:tcMar>
               <w:top w:w="70" w:type="dxa"/>
@@ -1278,7 +1278,7 @@
         </w:tc>
         <w:tc>
           <w:tcPr>
-            <w:tcW w:type="dxa" w:w="3120"/>
+            <w:tcW w:type="dxa" w:w="3312"/>
             <w:shd w:fill="FFFFFF"/>
             <w:tcMar>
               <w:top w:w="70" w:type="dxa"/>
@@ -1299,7 +1299,7 @@
         </w:tc>
         <w:tc>
           <w:tcPr>
-            <w:tcW w:type="dxa" w:w="3120"/>
+            <w:tcW w:type="dxa" w:w="3312"/>
             <w:shd w:fill="FFFFFF"/>
             <w:tcMar>
               <w:top w:w="70" w:type="dxa"/>
@@ -1342,171 +1342,1041 @@
     </w:p>
     <w:p>
       <w:pPr>
+        <w:spacing w:after="80"/>
+      </w:pPr>
+      <w:r>
+        <w:rPr>
+          <w:rFonts w:ascii="Calibri" w:hAnsi="Calibri"/>
+          <w:b/>
+          <w:color w:val="1E3A8A"/>
+          <w:sz w:val="23"/>
+        </w:rPr>
+        <w:t>4.1 Mapa de Proceso (Macroproceso)</w:t>
+      </w:r>
+    </w:p>
+    <w:tbl>
+      <w:tblPr>
+        <w:tblW w:type="auto" w:w="0"/>
+        <w:jc w:val="center"/>
+        <w:tblLook w:firstColumn="1" w:firstRow="1" w:lastColumn="0" w:lastRow="0" w:noHBand="0" w:noVBand="1" w:val="04A0"/>
+      </w:tblPr>
+      <w:tblGrid>
+        <w:gridCol w:w="3312"/>
+        <w:gridCol w:w="3312"/>
+        <w:gridCol w:w="3312"/>
+      </w:tblGrid>
+      <w:tr>
+        <w:tc>
+          <w:tcPr>
+            <w:tcW w:type="dxa" w:w="3312"/>
+            <w:shd w:fill="1E3A8A"/>
+            <w:tcMar>
+              <w:top w:w="80" w:type="dxa"/>
+              <w:bottom w:w="80" w:type="dxa"/>
+              <w:left w:w="80" w:type="dxa"/>
+              <w:right w:w="80" w:type="dxa"/>
+            </w:tcMar>
+          </w:tcPr>
+          <w:p>
+            <w:pPr>
+              <w:jc w:val="center"/>
+            </w:pPr>
+            <w:r>
+              <w:rPr>
+                <w:rFonts w:ascii="Calibri" w:hAnsi="Calibri"/>
+                <w:b/>
+                <w:color w:val="FFFFFF"/>
+                <w:sz w:val="19"/>
+              </w:rPr>
+              <w:t>ENTRADAS</w:t>
+            </w:r>
+          </w:p>
+        </w:tc>
+        <w:tc>
+          <w:tcPr>
+            <w:tcW w:type="dxa" w:w="3312"/>
+            <w:shd w:fill="1E3A8A"/>
+            <w:tcMar>
+              <w:top w:w="80" w:type="dxa"/>
+              <w:bottom w:w="80" w:type="dxa"/>
+              <w:left w:w="80" w:type="dxa"/>
+              <w:right w:w="80" w:type="dxa"/>
+            </w:tcMar>
+          </w:tcPr>
+          <w:p>
+            <w:pPr>
+              <w:jc w:val="center"/>
+            </w:pPr>
+            <w:r>
+              <w:rPr>
+                <w:rFonts w:ascii="Calibri" w:hAnsi="Calibri"/>
+                <w:b/>
+                <w:color w:val="FFFFFF"/>
+                <w:sz w:val="19"/>
+              </w:rPr>
+              <w:t>PROCESO PRINCIPAL</w:t>
+            </w:r>
+          </w:p>
+        </w:tc>
+        <w:tc>
+          <w:tcPr>
+            <w:tcW w:type="dxa" w:w="3312"/>
+            <w:shd w:fill="1E3A8A"/>
+            <w:tcMar>
+              <w:top w:w="80" w:type="dxa"/>
+              <w:bottom w:w="80" w:type="dxa"/>
+              <w:left w:w="80" w:type="dxa"/>
+              <w:right w:w="80" w:type="dxa"/>
+            </w:tcMar>
+          </w:tcPr>
+          <w:p>
+            <w:pPr>
+              <w:jc w:val="center"/>
+            </w:pPr>
+            <w:r>
+              <w:rPr>
+                <w:rFonts w:ascii="Calibri" w:hAnsi="Calibri"/>
+                <w:b/>
+                <w:color w:val="FFFFFF"/>
+                <w:sz w:val="19"/>
+              </w:rPr>
+              <w:t>SALIDAS &amp; ANÁLISIS</w:t>
+            </w:r>
+          </w:p>
+        </w:tc>
+      </w:tr>
+      <w:tr>
+        <w:tc>
+          <w:tcPr>
+            <w:tcW w:type="dxa" w:w="3312"/>
+            <w:shd w:fill="EFF6FF"/>
+            <w:tcMar>
+              <w:top w:w="100" w:type="dxa"/>
+              <w:bottom w:w="100" w:type="dxa"/>
+              <w:left w:w="100" w:type="dxa"/>
+              <w:right w:w="100" w:type="dxa"/>
+            </w:tcMar>
+          </w:tcPr>
+          <w:p>
+            <w:r>
+              <w:rPr>
+                <w:rFonts w:ascii="Calibri" w:hAnsi="Calibri"/>
+                <w:sz w:val="18"/>
+              </w:rPr>
+              <w:t>• Chofer / Novedad WhatsApp</w:t>
+              <w:br/>
+              <w:t>• Plan de Preventivos Programados</w:t>
+              <w:br/>
+              <w:t>• Solicitud de Herrería</w:t>
+            </w:r>
+          </w:p>
+        </w:tc>
+        <w:tc>
+          <w:tcPr>
+            <w:tcW w:type="dxa" w:w="3312"/>
+            <w:shd w:fill="EFF6FF"/>
+            <w:tcMar>
+              <w:top w:w="100" w:type="dxa"/>
+              <w:bottom w:w="100" w:type="dxa"/>
+              <w:left w:w="100" w:type="dxa"/>
+              <w:right w:w="100" w:type="dxa"/>
+            </w:tcMar>
+          </w:tcPr>
+          <w:p>
+            <w:r>
+              <w:rPr>
+                <w:rFonts w:ascii="Calibri" w:hAnsi="Calibri"/>
+                <w:sz w:val="18"/>
+              </w:rPr>
+              <w:t>1. Registro &amp; Clasificación (App Nativa)</w:t>
+              <w:br/>
+              <w:t>2. Ejecución &amp; Tiempos (Mecánicos)</w:t>
+              <w:br/>
+              <w:t>3. Control &amp; Validación (Supervisor)</w:t>
+              <w:br/>
+              <w:t>4. Sincronización Oficial (Asistente IA)</w:t>
+            </w:r>
+          </w:p>
+        </w:tc>
+        <w:tc>
+          <w:tcPr>
+            <w:tcW w:type="dxa" w:w="3312"/>
+            <w:shd w:fill="EFF6FF"/>
+            <w:tcMar>
+              <w:top w:w="100" w:type="dxa"/>
+              <w:bottom w:w="100" w:type="dxa"/>
+              <w:left w:w="100" w:type="dxa"/>
+              <w:right w:w="100" w:type="dxa"/>
+            </w:tcMar>
+          </w:tcPr>
+          <w:p>
+            <w:r>
+              <w:rPr>
+                <w:rFonts w:ascii="Calibri" w:hAnsi="Calibri"/>
+                <w:sz w:val="18"/>
+              </w:rPr>
+              <w:t>• Unidad Operativa en Ruta ✅</w:t>
+              <w:br/>
+              <w:t>• Google Sheets 2026 (KPI &amp; Rankings)</w:t>
+              <w:br/>
+              <w:t>• Asistente Hugo AI (Consultas)</w:t>
+            </w:r>
+          </w:p>
+        </w:tc>
+      </w:tr>
+    </w:tbl>
+    <w:p>
+      <w:pPr>
+        <w:spacing w:after="160"/>
+      </w:pPr>
+    </w:p>
+    <w:p>
+      <w:pPr>
         <w:spacing w:after="120"/>
       </w:pPr>
       <w:r>
         <w:rPr>
           <w:rFonts w:ascii="Calibri" w:hAnsi="Calibri"/>
           <w:b/>
-          <w:sz w:val="21"/>
+          <w:color w:val="1E3A8A"/>
+          <w:sz w:val="23"/>
         </w:rPr>
-        <w:t>Secuencia Operativa Estandarizada:</w:t>
+        <w:t>4.2 Flujograma Operativo Detallado (Paso a Paso)</w:t>
       </w:r>
     </w:p>
-    <w:p>
-      <w:pPr>
-        <w:spacing w:after="60"/>
-        <w:ind w:left="288"/>
-      </w:pPr>
-      <w:r>
-        <w:rPr>
-          <w:rFonts w:ascii="Calibri" w:hAnsi="Calibri"/>
-          <w:b/>
-          <w:color w:val="1E3A8A"/>
-          <w:sz w:val="20"/>
-        </w:rPr>
-        <w:t xml:space="preserve">• Paso 1: Detección y Notificación: </w:t>
-      </w:r>
-      <w:r>
-        <w:rPr>
-          <w:rFonts w:ascii="Calibri" w:hAnsi="Calibri"/>
-          <w:sz w:val="20"/>
-        </w:rPr>
-        <w:t>Chofer reporta novedad por Chatbot WhatsApp o se activa Preventivo Programado por kilometraje.</w:t>
-      </w:r>
-    </w:p>
-    <w:p>
-      <w:pPr>
-        <w:spacing w:after="60"/>
-        <w:ind w:left="288"/>
-      </w:pPr>
-      <w:r>
-        <w:rPr>
-          <w:rFonts w:ascii="Calibri" w:hAnsi="Calibri"/>
-          <w:b/>
-          <w:color w:val="1E3A8A"/>
-          <w:sz w:val="20"/>
-        </w:rPr>
-        <w:t xml:space="preserve">• Paso 2: Registro en App Nativa: </w:t>
-      </w:r>
-      <w:r>
-        <w:rPr>
-          <w:rFonts w:ascii="Calibri" w:hAnsi="Calibri"/>
-          <w:sz w:val="20"/>
-        </w:rPr>
-        <w:t>Actualización automática de estado de flota (Fuera de Servicio / Reparación) y apertura de OT en App Nativa (Railway).</w:t>
-      </w:r>
-    </w:p>
-    <w:p>
-      <w:pPr>
-        <w:spacing w:after="60"/>
-        <w:ind w:left="288"/>
-      </w:pPr>
-      <w:r>
-        <w:rPr>
-          <w:rFonts w:ascii="Calibri" w:hAnsi="Calibri"/>
-          <w:b/>
-          <w:color w:val="1E3A8A"/>
-          <w:sz w:val="20"/>
-        </w:rPr>
-        <w:t xml:space="preserve">• Paso 3: Planificación y Tareas: </w:t>
-      </w:r>
-      <w:r>
-        <w:rPr>
-          <w:rFonts w:ascii="Calibri" w:hAnsi="Calibri"/>
-          <w:sz w:val="20"/>
-        </w:rPr>
-        <w:t>Pañol asigna Mecánico, Centro de Costo (Motor, Frenos, etc.), Horas Estimadas e Insumos.</w:t>
-      </w:r>
-    </w:p>
-    <w:p>
-      <w:pPr>
-        <w:spacing w:after="60"/>
-        <w:ind w:left="288"/>
-      </w:pPr>
-      <w:r>
-        <w:rPr>
-          <w:rFonts w:ascii="Calibri" w:hAnsi="Calibri"/>
-          <w:b/>
-          <w:color w:val="1E3A8A"/>
-          <w:sz w:val="20"/>
-        </w:rPr>
-        <w:t xml:space="preserve">• Paso 4: Ejecución y Cronómetro: </w:t>
-      </w:r>
-      <w:r>
-        <w:rPr>
-          <w:rFonts w:ascii="Calibri" w:hAnsi="Calibri"/>
-          <w:sz w:val="20"/>
-        </w:rPr>
-        <w:t>Mecánico inicia cronómetro en App, ejecuta reparación, registra repuestos usados y finaliza tarea.</w:t>
-      </w:r>
-    </w:p>
-    <w:p>
-      <w:pPr>
-        <w:spacing w:after="60"/>
-        <w:ind w:left="288"/>
-      </w:pPr>
-      <w:r>
-        <w:rPr>
-          <w:rFonts w:ascii="Calibri" w:hAnsi="Calibri"/>
-          <w:b/>
-          <w:color w:val="1E3A8A"/>
-          <w:sz w:val="20"/>
-        </w:rPr>
-        <w:t xml:space="preserve">• Paso 5: Validación de Calidad: </w:t>
-      </w:r>
-      <w:r>
-        <w:rPr>
-          <w:rFonts w:ascii="Calibri" w:hAnsi="Calibri"/>
-          <w:sz w:val="20"/>
-        </w:rPr>
-        <w:t>Pañolero / Controlador verifica trabajo completado 100% y presiona 'Sincronizar'.</w:t>
-      </w:r>
-    </w:p>
-    <w:p>
-      <w:pPr>
-        <w:spacing w:after="60"/>
-        <w:ind w:left="288"/>
-      </w:pPr>
-      <w:r>
-        <w:rPr>
-          <w:rFonts w:ascii="Calibri" w:hAnsi="Calibri"/>
-          <w:b/>
-          <w:color w:val="1E3A8A"/>
-          <w:sz w:val="20"/>
-        </w:rPr>
-        <w:t xml:space="preserve">• Paso 6: Sincronización Puppeteer: </w:t>
-      </w:r>
-      <w:r>
-        <w:rPr>
-          <w:rFonts w:ascii="Calibri" w:hAnsi="Calibri"/>
-          <w:sz w:val="20"/>
-        </w:rPr>
-        <w:t>Robot automático en segundo plano se loguea en Taxes.com.ar, crea la OT oficial y obtiene N° OT (ej: #26972).</w:t>
-      </w:r>
-    </w:p>
-    <w:p>
-      <w:pPr>
-        <w:spacing w:after="60"/>
-        <w:ind w:left="288"/>
-      </w:pPr>
-      <w:r>
-        <w:rPr>
-          <w:rFonts w:ascii="Calibri" w:hAnsi="Calibri"/>
-          <w:b/>
-          <w:color w:val="1E3A8A"/>
-          <w:sz w:val="20"/>
-        </w:rPr>
-        <w:t xml:space="preserve">• Paso 7: Archivado y Análisis: </w:t>
-      </w:r>
-      <w:r>
-        <w:rPr>
-          <w:rFonts w:ascii="Calibri" w:hAnsi="Calibri"/>
-          <w:sz w:val="20"/>
-        </w:rPr>
-        <w:t>La OT pasa a Historial en la App Nativa, se exporta a Google Sheets 2026 y queda disponible para consultas en Hugo AI.</w:t>
-      </w:r>
-    </w:p>
+    <w:tbl>
+      <w:tblPr>
+        <w:tblW w:type="auto" w:w="0"/>
+        <w:jc w:val="center"/>
+        <w:tblLook w:firstColumn="1" w:firstRow="1" w:lastColumn="0" w:lastRow="0" w:noHBand="0" w:noVBand="1" w:val="04A0"/>
+      </w:tblPr>
+      <w:tblGrid>
+        <w:gridCol w:w="4968"/>
+        <w:gridCol w:w="4968"/>
+      </w:tblGrid>
+      <w:tr>
+        <w:tc>
+          <w:tcPr>
+            <w:tcW w:type="dxa" w:w="4968"/>
+            <w:shd w:fill="3B82F6"/>
+            <w:tcMar>
+              <w:top w:w="60" w:type="dxa"/>
+              <w:bottom w:w="60" w:type="dxa"/>
+              <w:left w:w="80" w:type="dxa"/>
+              <w:right w:w="80" w:type="dxa"/>
+            </w:tcMar>
+          </w:tcPr>
+          <w:p>
+            <w:pPr>
+              <w:jc w:val="center"/>
+            </w:pPr>
+            <w:r>
+              <w:rPr>
+                <w:rFonts w:ascii="Calibri" w:hAnsi="Calibri"/>
+                <w:b/>
+                <w:color w:val="FFFFFF"/>
+                <w:sz w:val="19"/>
+              </w:rPr>
+              <w:t>INICIO</w:t>
+            </w:r>
+          </w:p>
+        </w:tc>
+        <w:tc>
+          <w:tcPr>
+            <w:tcW w:type="dxa" w:w="4968"/>
+            <w:shd w:fill="F8FAFC"/>
+            <w:tcMar>
+              <w:top w:w="60" w:type="dxa"/>
+              <w:bottom w:w="60" w:type="dxa"/>
+              <w:left w:w="80" w:type="dxa"/>
+              <w:right w:w="80" w:type="dxa"/>
+            </w:tcMar>
+          </w:tcPr>
+          <w:p>
+            <w:pPr>
+              <w:spacing w:after="0"/>
+            </w:pPr>
+            <w:r>
+              <w:rPr>
+                <w:rFonts w:ascii="Calibri" w:hAnsi="Calibri"/>
+                <w:b/>
+                <w:sz w:val="19"/>
+              </w:rPr>
+              <w:t>Detección de Falla, Novedad, Preventivo o Herrería</w:t>
+            </w:r>
+          </w:p>
+        </w:tc>
+      </w:tr>
+      <w:tr>
+        <w:tc>
+          <w:tcPr>
+            <w:tcW w:type="dxa" w:w="4968"/>
+            <w:shd w:fill="FFFFFF"/>
+            <w:tcMar>
+              <w:top w:w="20" w:type="dxa"/>
+              <w:bottom w:w="20" w:type="dxa"/>
+              <w:left w:w="50" w:type="dxa"/>
+              <w:right w:w="50" w:type="dxa"/>
+            </w:tcMar>
+          </w:tcPr>
+          <w:p>
+            <w:pPr>
+              <w:jc w:val="center"/>
+            </w:pPr>
+            <w:r>
+              <w:rPr>
+                <w:b/>
+                <w:color w:val="64748B"/>
+                <w:sz w:val="22"/>
+              </w:rPr>
+              <w:t>⬇</w:t>
+            </w:r>
+          </w:p>
+        </w:tc>
+        <w:tc>
+          <w:tcPr>
+            <w:tcW w:type="dxa" w:w="4968"/>
+            <w:shd w:fill="FFFFFF"/>
+            <w:tcMar>
+              <w:top w:w="20" w:type="dxa"/>
+              <w:bottom w:w="20" w:type="dxa"/>
+              <w:left w:w="50" w:type="dxa"/>
+              <w:right w:w="50" w:type="dxa"/>
+            </w:tcMar>
+          </w:tcPr>
+          <w:p>
+            <w:pPr>
+              <w:spacing w:after="0"/>
+            </w:pPr>
+          </w:p>
+        </w:tc>
+      </w:tr>
+      <w:tr>
+        <w:tc>
+          <w:tcPr>
+            <w:tcW w:type="dxa" w:w="4968"/>
+            <w:shd w:fill="1E3A8A"/>
+            <w:tcMar>
+              <w:top w:w="60" w:type="dxa"/>
+              <w:bottom w:w="60" w:type="dxa"/>
+              <w:left w:w="80" w:type="dxa"/>
+              <w:right w:w="80" w:type="dxa"/>
+            </w:tcMar>
+          </w:tcPr>
+          <w:p>
+            <w:pPr>
+              <w:jc w:val="center"/>
+            </w:pPr>
+            <w:r>
+              <w:rPr>
+                <w:rFonts w:ascii="Calibri" w:hAnsi="Calibri"/>
+                <w:b/>
+                <w:color w:val="FFFFFF"/>
+                <w:sz w:val="19"/>
+              </w:rPr>
+              <w:t>1. RECEPCIÓN</w:t>
+            </w:r>
+          </w:p>
+        </w:tc>
+        <w:tc>
+          <w:tcPr>
+            <w:tcW w:type="dxa" w:w="4968"/>
+            <w:shd w:fill="F8FAFC"/>
+            <w:tcMar>
+              <w:top w:w="60" w:type="dxa"/>
+              <w:bottom w:w="60" w:type="dxa"/>
+              <w:left w:w="80" w:type="dxa"/>
+              <w:right w:w="80" w:type="dxa"/>
+            </w:tcMar>
+          </w:tcPr>
+          <w:p>
+            <w:pPr>
+              <w:spacing w:after="0"/>
+            </w:pPr>
+            <w:r>
+              <w:rPr>
+                <w:rFonts w:ascii="Calibri" w:hAnsi="Calibri"/>
+                <w:sz w:val="19"/>
+              </w:rPr>
+              <w:t>Ruta/Auxilio vía Chatbot WhatsApp  OR  Preventivo/Herrería vía App Nativa</w:t>
+            </w:r>
+          </w:p>
+        </w:tc>
+      </w:tr>
+      <w:tr>
+        <w:tc>
+          <w:tcPr>
+            <w:tcW w:type="dxa" w:w="4968"/>
+            <w:shd w:fill="FFFFFF"/>
+            <w:tcMar>
+              <w:top w:w="20" w:type="dxa"/>
+              <w:bottom w:w="20" w:type="dxa"/>
+              <w:left w:w="50" w:type="dxa"/>
+              <w:right w:w="50" w:type="dxa"/>
+            </w:tcMar>
+          </w:tcPr>
+          <w:p>
+            <w:pPr>
+              <w:jc w:val="center"/>
+            </w:pPr>
+            <w:r>
+              <w:rPr>
+                <w:b/>
+                <w:color w:val="64748B"/>
+                <w:sz w:val="22"/>
+              </w:rPr>
+              <w:t>⬇</w:t>
+            </w:r>
+          </w:p>
+        </w:tc>
+        <w:tc>
+          <w:tcPr>
+            <w:tcW w:type="dxa" w:w="4968"/>
+            <w:shd w:fill="FFFFFF"/>
+            <w:tcMar>
+              <w:top w:w="20" w:type="dxa"/>
+              <w:bottom w:w="20" w:type="dxa"/>
+              <w:left w:w="50" w:type="dxa"/>
+              <w:right w:w="50" w:type="dxa"/>
+            </w:tcMar>
+          </w:tcPr>
+          <w:p>
+            <w:pPr>
+              <w:spacing w:after="0"/>
+            </w:pPr>
+          </w:p>
+        </w:tc>
+      </w:tr>
+      <w:tr>
+        <w:tc>
+          <w:tcPr>
+            <w:tcW w:type="dxa" w:w="4968"/>
+            <w:shd w:fill="1E3A8A"/>
+            <w:tcMar>
+              <w:top w:w="60" w:type="dxa"/>
+              <w:bottom w:w="60" w:type="dxa"/>
+              <w:left w:w="80" w:type="dxa"/>
+              <w:right w:w="80" w:type="dxa"/>
+            </w:tcMar>
+          </w:tcPr>
+          <w:p>
+            <w:pPr>
+              <w:jc w:val="center"/>
+            </w:pPr>
+            <w:r>
+              <w:rPr>
+                <w:rFonts w:ascii="Calibri" w:hAnsi="Calibri"/>
+                <w:b/>
+                <w:color w:val="FFFFFF"/>
+                <w:sz w:val="19"/>
+              </w:rPr>
+              <w:t>2. REGISTRO</w:t>
+            </w:r>
+          </w:p>
+        </w:tc>
+        <w:tc>
+          <w:tcPr>
+            <w:tcW w:type="dxa" w:w="4968"/>
+            <w:shd w:fill="F8FAFC"/>
+            <w:tcMar>
+              <w:top w:w="60" w:type="dxa"/>
+              <w:bottom w:w="60" w:type="dxa"/>
+              <w:left w:w="80" w:type="dxa"/>
+              <w:right w:w="80" w:type="dxa"/>
+            </w:tcMar>
+          </w:tcPr>
+          <w:p>
+            <w:pPr>
+              <w:spacing w:after="0"/>
+            </w:pPr>
+            <w:r>
+              <w:rPr>
+                <w:rFonts w:ascii="Calibri" w:hAnsi="Calibri"/>
+                <w:sz w:val="19"/>
+              </w:rPr>
+              <w:t>Parte de Taller actualiza estado (Fuera de Servicio/Reparación) + Supervisor abre OT</w:t>
+            </w:r>
+          </w:p>
+        </w:tc>
+      </w:tr>
+      <w:tr>
+        <w:tc>
+          <w:tcPr>
+            <w:tcW w:type="dxa" w:w="4968"/>
+            <w:shd w:fill="FFFFFF"/>
+            <w:tcMar>
+              <w:top w:w="20" w:type="dxa"/>
+              <w:bottom w:w="20" w:type="dxa"/>
+              <w:left w:w="50" w:type="dxa"/>
+              <w:right w:w="50" w:type="dxa"/>
+            </w:tcMar>
+          </w:tcPr>
+          <w:p>
+            <w:pPr>
+              <w:jc w:val="center"/>
+            </w:pPr>
+            <w:r>
+              <w:rPr>
+                <w:b/>
+                <w:color w:val="64748B"/>
+                <w:sz w:val="22"/>
+              </w:rPr>
+              <w:t>⬇</w:t>
+            </w:r>
+          </w:p>
+        </w:tc>
+        <w:tc>
+          <w:tcPr>
+            <w:tcW w:type="dxa" w:w="4968"/>
+            <w:shd w:fill="FFFFFF"/>
+            <w:tcMar>
+              <w:top w:w="20" w:type="dxa"/>
+              <w:bottom w:w="20" w:type="dxa"/>
+              <w:left w:w="50" w:type="dxa"/>
+              <w:right w:w="50" w:type="dxa"/>
+            </w:tcMar>
+          </w:tcPr>
+          <w:p>
+            <w:pPr>
+              <w:spacing w:after="0"/>
+            </w:pPr>
+          </w:p>
+        </w:tc>
+      </w:tr>
+      <w:tr>
+        <w:tc>
+          <w:tcPr>
+            <w:tcW w:type="dxa" w:w="4968"/>
+            <w:shd w:fill="1E3A8A"/>
+            <w:tcMar>
+              <w:top w:w="60" w:type="dxa"/>
+              <w:bottom w:w="60" w:type="dxa"/>
+              <w:left w:w="80" w:type="dxa"/>
+              <w:right w:w="80" w:type="dxa"/>
+            </w:tcMar>
+          </w:tcPr>
+          <w:p>
+            <w:pPr>
+              <w:jc w:val="center"/>
+            </w:pPr>
+            <w:r>
+              <w:rPr>
+                <w:rFonts w:ascii="Calibri" w:hAnsi="Calibri"/>
+                <w:b/>
+                <w:color w:val="FFFFFF"/>
+                <w:sz w:val="19"/>
+              </w:rPr>
+              <w:t>3. ASIGNACIÓN</w:t>
+            </w:r>
+          </w:p>
+        </w:tc>
+        <w:tc>
+          <w:tcPr>
+            <w:tcW w:type="dxa" w:w="4968"/>
+            <w:shd w:fill="F8FAFC"/>
+            <w:tcMar>
+              <w:top w:w="60" w:type="dxa"/>
+              <w:bottom w:w="60" w:type="dxa"/>
+              <w:left w:w="80" w:type="dxa"/>
+              <w:right w:w="80" w:type="dxa"/>
+            </w:tcMar>
+          </w:tcPr>
+          <w:p>
+            <w:pPr>
+              <w:spacing w:after="0"/>
+            </w:pPr>
+            <w:r>
+              <w:rPr>
+                <w:rFonts w:ascii="Calibri" w:hAnsi="Calibri"/>
+                <w:sz w:val="19"/>
+              </w:rPr>
+              <w:t>Supervisor asigna Tareas (Preventivo/Correctivo/Herrería), Mecánico e Insumos</w:t>
+            </w:r>
+          </w:p>
+        </w:tc>
+      </w:tr>
+      <w:tr>
+        <w:tc>
+          <w:tcPr>
+            <w:tcW w:type="dxa" w:w="4968"/>
+            <w:shd w:fill="FFFFFF"/>
+            <w:tcMar>
+              <w:top w:w="20" w:type="dxa"/>
+              <w:bottom w:w="20" w:type="dxa"/>
+              <w:left w:w="50" w:type="dxa"/>
+              <w:right w:w="50" w:type="dxa"/>
+            </w:tcMar>
+          </w:tcPr>
+          <w:p>
+            <w:pPr>
+              <w:jc w:val="center"/>
+            </w:pPr>
+            <w:r>
+              <w:rPr>
+                <w:b/>
+                <w:color w:val="64748B"/>
+                <w:sz w:val="22"/>
+              </w:rPr>
+              <w:t>⬇</w:t>
+            </w:r>
+          </w:p>
+        </w:tc>
+        <w:tc>
+          <w:tcPr>
+            <w:tcW w:type="dxa" w:w="4968"/>
+            <w:shd w:fill="FFFFFF"/>
+            <w:tcMar>
+              <w:top w:w="20" w:type="dxa"/>
+              <w:bottom w:w="20" w:type="dxa"/>
+              <w:left w:w="50" w:type="dxa"/>
+              <w:right w:w="50" w:type="dxa"/>
+            </w:tcMar>
+          </w:tcPr>
+          <w:p>
+            <w:pPr>
+              <w:spacing w:after="0"/>
+            </w:pPr>
+          </w:p>
+        </w:tc>
+      </w:tr>
+      <w:tr>
+        <w:tc>
+          <w:tcPr>
+            <w:tcW w:type="dxa" w:w="4968"/>
+            <w:shd w:fill="1E3A8A"/>
+            <w:tcMar>
+              <w:top w:w="60" w:type="dxa"/>
+              <w:bottom w:w="60" w:type="dxa"/>
+              <w:left w:w="80" w:type="dxa"/>
+              <w:right w:w="80" w:type="dxa"/>
+            </w:tcMar>
+          </w:tcPr>
+          <w:p>
+            <w:pPr>
+              <w:jc w:val="center"/>
+            </w:pPr>
+            <w:r>
+              <w:rPr>
+                <w:rFonts w:ascii="Calibri" w:hAnsi="Calibri"/>
+                <w:b/>
+                <w:color w:val="FFFFFF"/>
+                <w:sz w:val="19"/>
+              </w:rPr>
+              <w:t>4. EJECUCIÓN</w:t>
+            </w:r>
+          </w:p>
+        </w:tc>
+        <w:tc>
+          <w:tcPr>
+            <w:tcW w:type="dxa" w:w="4968"/>
+            <w:shd w:fill="F8FAFC"/>
+            <w:tcMar>
+              <w:top w:w="60" w:type="dxa"/>
+              <w:bottom w:w="60" w:type="dxa"/>
+              <w:left w:w="80" w:type="dxa"/>
+              <w:right w:w="80" w:type="dxa"/>
+            </w:tcMar>
+          </w:tcPr>
+          <w:p>
+            <w:pPr>
+              <w:spacing w:after="0"/>
+            </w:pPr>
+            <w:r>
+              <w:rPr>
+                <w:rFonts w:ascii="Calibri" w:hAnsi="Calibri"/>
+                <w:sz w:val="19"/>
+              </w:rPr>
+              <w:t>Mecánico inicia Cronómetro en App Nativa, ejecuta trabajo y registra insumos</w:t>
+            </w:r>
+          </w:p>
+        </w:tc>
+      </w:tr>
+      <w:tr>
+        <w:tc>
+          <w:tcPr>
+            <w:tcW w:type="dxa" w:w="4968"/>
+            <w:shd w:fill="FFFFFF"/>
+            <w:tcMar>
+              <w:top w:w="20" w:type="dxa"/>
+              <w:bottom w:w="20" w:type="dxa"/>
+              <w:left w:w="50" w:type="dxa"/>
+              <w:right w:w="50" w:type="dxa"/>
+            </w:tcMar>
+          </w:tcPr>
+          <w:p>
+            <w:pPr>
+              <w:jc w:val="center"/>
+            </w:pPr>
+            <w:r>
+              <w:rPr>
+                <w:b/>
+                <w:color w:val="64748B"/>
+                <w:sz w:val="22"/>
+              </w:rPr>
+              <w:t>⬇</w:t>
+            </w:r>
+          </w:p>
+        </w:tc>
+        <w:tc>
+          <w:tcPr>
+            <w:tcW w:type="dxa" w:w="4968"/>
+            <w:shd w:fill="FFFFFF"/>
+            <w:tcMar>
+              <w:top w:w="20" w:type="dxa"/>
+              <w:bottom w:w="20" w:type="dxa"/>
+              <w:left w:w="50" w:type="dxa"/>
+              <w:right w:w="50" w:type="dxa"/>
+            </w:tcMar>
+          </w:tcPr>
+          <w:p>
+            <w:pPr>
+              <w:spacing w:after="0"/>
+            </w:pPr>
+          </w:p>
+        </w:tc>
+      </w:tr>
+      <w:tr>
+        <w:tc>
+          <w:tcPr>
+            <w:tcW w:type="dxa" w:w="4968"/>
+            <w:shd w:fill="0F172A"/>
+            <w:tcMar>
+              <w:top w:w="60" w:type="dxa"/>
+              <w:bottom w:w="60" w:type="dxa"/>
+              <w:left w:w="80" w:type="dxa"/>
+              <w:right w:w="80" w:type="dxa"/>
+            </w:tcMar>
+          </w:tcPr>
+          <w:p>
+            <w:pPr>
+              <w:jc w:val="center"/>
+            </w:pPr>
+            <w:r>
+              <w:rPr>
+                <w:rFonts w:ascii="Calibri" w:hAnsi="Calibri"/>
+                <w:b/>
+                <w:color w:val="FFFFFF"/>
+                <w:sz w:val="19"/>
+              </w:rPr>
+              <w:t>5. CONTROL</w:t>
+            </w:r>
+          </w:p>
+        </w:tc>
+        <w:tc>
+          <w:tcPr>
+            <w:tcW w:type="dxa" w:w="4968"/>
+            <w:shd w:fill="F8FAFC"/>
+            <w:tcMar>
+              <w:top w:w="60" w:type="dxa"/>
+              <w:bottom w:w="60" w:type="dxa"/>
+              <w:left w:w="80" w:type="dxa"/>
+              <w:right w:w="80" w:type="dxa"/>
+            </w:tcMar>
+          </w:tcPr>
+          <w:p>
+            <w:pPr>
+              <w:spacing w:after="0"/>
+            </w:pPr>
+            <w:r>
+              <w:rPr>
+                <w:rFonts w:ascii="Calibri" w:hAnsi="Calibri"/>
+                <w:sz w:val="19"/>
+              </w:rPr>
+              <w:t>Supervisor / Jefe de Taller realiza Inspección Final y aprueba envío</w:t>
+            </w:r>
+          </w:p>
+        </w:tc>
+      </w:tr>
+      <w:tr>
+        <w:tc>
+          <w:tcPr>
+            <w:tcW w:type="dxa" w:w="4968"/>
+            <w:shd w:fill="FFFFFF"/>
+            <w:tcMar>
+              <w:top w:w="20" w:type="dxa"/>
+              <w:bottom w:w="20" w:type="dxa"/>
+              <w:left w:w="50" w:type="dxa"/>
+              <w:right w:w="50" w:type="dxa"/>
+            </w:tcMar>
+          </w:tcPr>
+          <w:p>
+            <w:pPr>
+              <w:jc w:val="center"/>
+            </w:pPr>
+            <w:r>
+              <w:rPr>
+                <w:b/>
+                <w:color w:val="64748B"/>
+                <w:sz w:val="22"/>
+              </w:rPr>
+              <w:t>⬇</w:t>
+            </w:r>
+          </w:p>
+        </w:tc>
+        <w:tc>
+          <w:tcPr>
+            <w:tcW w:type="dxa" w:w="4968"/>
+            <w:shd w:fill="FFFFFF"/>
+            <w:tcMar>
+              <w:top w:w="20" w:type="dxa"/>
+              <w:bottom w:w="20" w:type="dxa"/>
+              <w:left w:w="50" w:type="dxa"/>
+              <w:right w:w="50" w:type="dxa"/>
+            </w:tcMar>
+          </w:tcPr>
+          <w:p>
+            <w:pPr>
+              <w:spacing w:after="0"/>
+            </w:pPr>
+          </w:p>
+        </w:tc>
+      </w:tr>
+      <w:tr>
+        <w:tc>
+          <w:tcPr>
+            <w:tcW w:type="dxa" w:w="4968"/>
+            <w:shd w:fill="047857"/>
+            <w:tcMar>
+              <w:top w:w="60" w:type="dxa"/>
+              <w:bottom w:w="60" w:type="dxa"/>
+              <w:left w:w="80" w:type="dxa"/>
+              <w:right w:w="80" w:type="dxa"/>
+            </w:tcMar>
+          </w:tcPr>
+          <w:p>
+            <w:pPr>
+              <w:jc w:val="center"/>
+            </w:pPr>
+            <w:r>
+              <w:rPr>
+                <w:rFonts w:ascii="Calibri" w:hAnsi="Calibri"/>
+                <w:b/>
+                <w:color w:val="FFFFFF"/>
+                <w:sz w:val="19"/>
+              </w:rPr>
+              <w:t>6. SYNC IA</w:t>
+            </w:r>
+          </w:p>
+        </w:tc>
+        <w:tc>
+          <w:tcPr>
+            <w:tcW w:type="dxa" w:w="4968"/>
+            <w:shd w:fill="F8FAFC"/>
+            <w:tcMar>
+              <w:top w:w="60" w:type="dxa"/>
+              <w:bottom w:w="60" w:type="dxa"/>
+              <w:left w:w="80" w:type="dxa"/>
+              <w:right w:w="80" w:type="dxa"/>
+            </w:tcMar>
+          </w:tcPr>
+          <w:p>
+            <w:pPr>
+              <w:spacing w:after="0"/>
+            </w:pPr>
+            <w:r>
+              <w:rPr>
+                <w:rFonts w:ascii="Calibri" w:hAnsi="Calibri"/>
+                <w:sz w:val="19"/>
+              </w:rPr>
+              <w:t>ASISTENTE IA (Sync Worker) sincroniza automáticamente con Taxes.com.ar y obtiene N° OT</w:t>
+            </w:r>
+          </w:p>
+        </w:tc>
+      </w:tr>
+      <w:tr>
+        <w:tc>
+          <w:tcPr>
+            <w:tcW w:type="dxa" w:w="4968"/>
+            <w:shd w:fill="FFFFFF"/>
+            <w:tcMar>
+              <w:top w:w="20" w:type="dxa"/>
+              <w:bottom w:w="20" w:type="dxa"/>
+              <w:left w:w="50" w:type="dxa"/>
+              <w:right w:w="50" w:type="dxa"/>
+            </w:tcMar>
+          </w:tcPr>
+          <w:p>
+            <w:pPr>
+              <w:jc w:val="center"/>
+            </w:pPr>
+            <w:r>
+              <w:rPr>
+                <w:b/>
+                <w:color w:val="64748B"/>
+                <w:sz w:val="22"/>
+              </w:rPr>
+              <w:t>⬇</w:t>
+            </w:r>
+          </w:p>
+        </w:tc>
+        <w:tc>
+          <w:tcPr>
+            <w:tcW w:type="dxa" w:w="4968"/>
+            <w:shd w:fill="FFFFFF"/>
+            <w:tcMar>
+              <w:top w:w="20" w:type="dxa"/>
+              <w:bottom w:w="20" w:type="dxa"/>
+              <w:left w:w="50" w:type="dxa"/>
+              <w:right w:w="50" w:type="dxa"/>
+            </w:tcMar>
+          </w:tcPr>
+          <w:p>
+            <w:pPr>
+              <w:spacing w:after="0"/>
+            </w:pPr>
+          </w:p>
+        </w:tc>
+      </w:tr>
+      <w:tr>
+        <w:tc>
+          <w:tcPr>
+            <w:tcW w:type="dxa" w:w="4968"/>
+            <w:shd w:fill="047857"/>
+            <w:tcMar>
+              <w:top w:w="60" w:type="dxa"/>
+              <w:bottom w:w="60" w:type="dxa"/>
+              <w:left w:w="80" w:type="dxa"/>
+              <w:right w:w="80" w:type="dxa"/>
+            </w:tcMar>
+          </w:tcPr>
+          <w:p>
+            <w:pPr>
+              <w:jc w:val="center"/>
+            </w:pPr>
+            <w:r>
+              <w:rPr>
+                <w:rFonts w:ascii="Calibri" w:hAnsi="Calibri"/>
+                <w:b/>
+                <w:color w:val="FFFFFF"/>
+                <w:sz w:val="19"/>
+              </w:rPr>
+              <w:t>7. ARCHIVADO</w:t>
+            </w:r>
+          </w:p>
+        </w:tc>
+        <w:tc>
+          <w:tcPr>
+            <w:tcW w:type="dxa" w:w="4968"/>
+            <w:shd w:fill="F8FAFC"/>
+            <w:tcMar>
+              <w:top w:w="60" w:type="dxa"/>
+              <w:bottom w:w="60" w:type="dxa"/>
+              <w:left w:w="80" w:type="dxa"/>
+              <w:right w:w="80" w:type="dxa"/>
+            </w:tcMar>
+          </w:tcPr>
+          <w:p>
+            <w:pPr>
+              <w:spacing w:after="0"/>
+            </w:pPr>
+            <w:r>
+              <w:rPr>
+                <w:rFonts w:ascii="Calibri" w:hAnsi="Calibri"/>
+                <w:sz w:val="19"/>
+              </w:rPr>
+              <w:t>Auto-archivado a Historial + Exportación a Google Sheets 2026 + Consulta en Hugo AI</w:t>
+            </w:r>
+          </w:p>
+        </w:tc>
+      </w:tr>
+      <w:tr>
+        <w:tc>
+          <w:tcPr>
+            <w:tcW w:type="dxa" w:w="4968"/>
+            <w:shd w:fill="FFFFFF"/>
+            <w:tcMar>
+              <w:top w:w="20" w:type="dxa"/>
+              <w:bottom w:w="20" w:type="dxa"/>
+              <w:left w:w="50" w:type="dxa"/>
+              <w:right w:w="50" w:type="dxa"/>
+            </w:tcMar>
+          </w:tcPr>
+          <w:p>
+            <w:pPr>
+              <w:jc w:val="center"/>
+            </w:pPr>
+            <w:r>
+              <w:rPr>
+                <w:b/>
+                <w:color w:val="64748B"/>
+                <w:sz w:val="22"/>
+              </w:rPr>
+              <w:t>⬇</w:t>
+            </w:r>
+          </w:p>
+        </w:tc>
+        <w:tc>
+          <w:tcPr>
+            <w:tcW w:type="dxa" w:w="4968"/>
+            <w:shd w:fill="FFFFFF"/>
+            <w:tcMar>
+              <w:top w:w="20" w:type="dxa"/>
+              <w:bottom w:w="20" w:type="dxa"/>
+              <w:left w:w="50" w:type="dxa"/>
+              <w:right w:w="50" w:type="dxa"/>
+            </w:tcMar>
+          </w:tcPr>
+          <w:p>
+            <w:pPr>
+              <w:spacing w:after="0"/>
+            </w:pPr>
+          </w:p>
+        </w:tc>
+      </w:tr>
+      <w:tr>
+        <w:tc>
+          <w:tcPr>
+            <w:tcW w:type="dxa" w:w="4968"/>
+            <w:shd w:fill="166534"/>
+            <w:tcMar>
+              <w:top w:w="60" w:type="dxa"/>
+              <w:bottom w:w="60" w:type="dxa"/>
+              <w:left w:w="80" w:type="dxa"/>
+              <w:right w:w="80" w:type="dxa"/>
+            </w:tcMar>
+          </w:tcPr>
+          <w:p>
+            <w:pPr>
+              <w:jc w:val="center"/>
+            </w:pPr>
+            <w:r>
+              <w:rPr>
+                <w:rFonts w:ascii="Calibri" w:hAnsi="Calibri"/>
+                <w:b/>
+                <w:color w:val="FFFFFF"/>
+                <w:sz w:val="19"/>
+              </w:rPr>
+              <w:t>FIN</w:t>
+            </w:r>
+          </w:p>
+        </w:tc>
+        <w:tc>
+          <w:tcPr>
+            <w:tcW w:type="dxa" w:w="4968"/>
+            <w:shd w:fill="F8FAFC"/>
+            <w:tcMar>
+              <w:top w:w="60" w:type="dxa"/>
+              <w:bottom w:w="60" w:type="dxa"/>
+              <w:left w:w="80" w:type="dxa"/>
+              <w:right w:w="80" w:type="dxa"/>
+            </w:tcMar>
+          </w:tcPr>
+          <w:p>
+            <w:pPr>
+              <w:spacing w:after="0"/>
+            </w:pPr>
+            <w:r>
+              <w:rPr>
+                <w:rFonts w:ascii="Calibri" w:hAnsi="Calibri"/>
+                <w:b/>
+                <w:sz w:val="19"/>
+              </w:rPr>
+              <w:t>Unidad Marcada como ✅ OPERATIVA y lista para servicio</w:t>
+            </w:r>
+          </w:p>
+        </w:tc>
+      </w:tr>
+    </w:tbl>
     <w:p>
       <w:pPr>
         <w:spacing w:after="200"/>
@@ -1558,7 +2428,7 @@
           <w:rFonts w:ascii="Calibri" w:hAnsi="Calibri"/>
           <w:sz w:val="20"/>
         </w:rPr>
-        <w:t>El chofer notifica fallas vía WhatsApp indicando número de interno (#118).</w:t>
+        <w:t>El chofer notifica inmediatamente cualquier falla, novedad, auxilio, operatividad o deficiencia vía Chatbot WhatsApp indicando número de interno (#118).</w:t>
       </w:r>
     </w:p>
     <w:p>
@@ -1596,7 +2466,7 @@
           <w:rFonts w:ascii="Calibri" w:hAnsi="Calibri"/>
           <w:sz w:val="20"/>
         </w:rPr>
-        <w:t>Pañol abre la Orden de Trabajo (OT) en la App Nativa.</w:t>
+        <w:t>El Supervisor / Jefe de Taller abre la Orden de Trabajo (OT) en la App Nativa.</w:t>
       </w:r>
     </w:p>
     <w:p>
@@ -1630,7 +2500,7 @@
           <w:rFonts w:ascii="Calibri" w:hAnsi="Calibri"/>
           <w:sz w:val="20"/>
         </w:rPr>
-        <w:t>Selección de clasificación: Preventivo o Correctivo.</w:t>
+        <w:t>Selección de clasificación: Preventivo, Correctivo o Herrería.</w:t>
       </w:r>
     </w:p>
     <w:p>
@@ -1649,7 +2519,7 @@
           <w:rFonts w:ascii="Calibri" w:hAnsi="Calibri"/>
           <w:sz w:val="20"/>
         </w:rPr>
-        <w:t>Asignación de mecánico responsable (ej: Belocures, César Hernán).</w:t>
+        <w:t>Asignación de mecánico o especialista responsable (ej: Belocures, César Hernán).</w:t>
       </w:r>
     </w:p>
     <w:p>
@@ -1721,7 +2591,7 @@
           <w:rFonts w:ascii="Calibri" w:hAnsi="Calibri"/>
           <w:sz w:val="20"/>
         </w:rPr>
-        <w:t>Utiliza el cronómetro integrado para medir la duración exacta de cada tarea.</w:t>
+        <w:t>Utiliza el cronómetro integrado en la App Nativa para medir la duración exacta de cada tarea.</w:t>
       </w:r>
     </w:p>
     <w:p>
@@ -1774,7 +2644,7 @@
           <w:rFonts w:ascii="Calibri" w:hAnsi="Calibri"/>
           <w:sz w:val="20"/>
         </w:rPr>
-        <w:t>El Jefe de Taller / Pañol realiza la inspección final.</w:t>
+        <w:t>El Supervisor / Jefe de Taller realiza la inspección final.</w:t>
       </w:r>
     </w:p>
     <w:p>
@@ -1827,7 +2697,7 @@
           <w:color w:val="1E3A8A"/>
           <w:sz w:val="26"/>
         </w:rPr>
-        <w:t>Etapa 5: Sincronización Automática Taxes.com.ar</w:t>
+        <w:t>Etapa 5: Sincronización Automática Taxes.com.ar (ASISTENTE IA)</w:t>
       </w:r>
     </w:p>
     <w:p>
@@ -1846,7 +2716,7 @@
           <w:rFonts w:ascii="Calibri" w:hAnsi="Calibri"/>
           <w:sz w:val="20"/>
         </w:rPr>
-        <w:t>El Robot Puppeteer (Sync Worker) toma la orden en background.</w:t>
+        <w:t>El ASISTENTE IA (Sync Worker Puppeteer) toma la orden en background.</w:t>
       </w:r>
     </w:p>
     <w:p>
@@ -1918,7 +2788,7 @@
           <w:rFonts w:ascii="Calibri" w:hAnsi="Calibri"/>
           <w:sz w:val="20"/>
         </w:rPr>
-        <w:t>Google Sheets 2026 actualiza indicadores KPI (MTBF, MTTR, ranking de fallas).</w:t>
+        <w:t>Google Sheets 2026 actualiza indicadores KPI (MTBF, MTTR, ranking de fallas por Kilómetros, Litros y Horas).</w:t>
       </w:r>
     </w:p>
     <w:p>
@@ -1967,13 +2837,13 @@
         <w:tblLook w:firstColumn="1" w:firstRow="1" w:lastColumn="0" w:lastRow="0" w:noHBand="0" w:noVBand="1" w:val="04A0"/>
       </w:tblPr>
       <w:tblGrid>
-        <w:gridCol w:w="4680"/>
-        <w:gridCol w:w="4680"/>
+        <w:gridCol w:w="4968"/>
+        <w:gridCol w:w="4968"/>
       </w:tblGrid>
       <w:tr>
         <w:tc>
           <w:tcPr>
-            <w:tcW w:type="dxa" w:w="4680"/>
+            <w:tcW w:type="dxa" w:w="4968"/>
             <w:shd w:fill="1E293B"/>
             <w:tcMar>
               <w:top w:w="90" w:type="dxa"/>
@@ -1996,7 +2866,7 @@
         </w:tc>
         <w:tc>
           <w:tcPr>
-            <w:tcW w:type="dxa" w:w="4680"/>
+            <w:tcW w:type="dxa" w:w="4968"/>
             <w:shd w:fill="1E293B"/>
             <w:tcMar>
               <w:top w:w="90" w:type="dxa"/>
@@ -2021,7 +2891,7 @@
       <w:tr>
         <w:tc>
           <w:tcPr>
-            <w:tcW w:type="dxa" w:w="4680"/>
+            <w:tcW w:type="dxa" w:w="4968"/>
             <w:shd w:fill="F8FAFC"/>
             <w:tcMar>
               <w:top w:w="70" w:type="dxa"/>
@@ -2043,7 +2913,7 @@
         </w:tc>
         <w:tc>
           <w:tcPr>
-            <w:tcW w:type="dxa" w:w="4680"/>
+            <w:tcW w:type="dxa" w:w="4968"/>
             <w:shd w:fill="F8FAFC"/>
             <w:tcMar>
               <w:top w:w="70" w:type="dxa"/>
@@ -2058,7 +2928,7 @@
                 <w:rFonts w:ascii="Calibri" w:hAnsi="Calibri"/>
                 <w:sz w:val="18"/>
               </w:rPr>
-              <w:t>Notificar inmediatamente cualquier falla vía Chatbot WhatsApp antes o durante el viaje.</w:t>
+              <w:t>Notificar inmediatamente cualquier falla vía Chatbot WhatsApp antes o durante el viaje: novedades, auxilios, operatividad o deficiencia.</w:t>
             </w:r>
           </w:p>
         </w:tc>
@@ -2066,7 +2936,7 @@
       <w:tr>
         <w:tc>
           <w:tcPr>
-            <w:tcW w:type="dxa" w:w="4680"/>
+            <w:tcW w:type="dxa" w:w="4968"/>
             <w:shd w:fill="FFFFFF"/>
             <w:tcMar>
               <w:top w:w="70" w:type="dxa"/>
@@ -2088,7 +2958,7 @@
         </w:tc>
         <w:tc>
           <w:tcPr>
-            <w:tcW w:type="dxa" w:w="4680"/>
+            <w:tcW w:type="dxa" w:w="4968"/>
             <w:shd w:fill="FFFFFF"/>
             <w:tcMar>
               <w:top w:w="70" w:type="dxa"/>
@@ -2111,7 +2981,7 @@
       <w:tr>
         <w:tc>
           <w:tcPr>
-            <w:tcW w:type="dxa" w:w="4680"/>
+            <w:tcW w:type="dxa" w:w="4968"/>
             <w:shd w:fill="F8FAFC"/>
             <w:tcMar>
               <w:top w:w="70" w:type="dxa"/>
@@ -2127,13 +2997,13 @@
                 <w:b/>
                 <w:sz w:val="18"/>
               </w:rPr>
-              <w:t>Pañolero / Jefe de Taller</w:t>
+              <w:t>Supervisor / Jefe de Taller</w:t>
             </w:r>
           </w:p>
         </w:tc>
         <w:tc>
           <w:tcPr>
-            <w:tcW w:type="dxa" w:w="4680"/>
+            <w:tcW w:type="dxa" w:w="4968"/>
             <w:shd w:fill="F8FAFC"/>
             <w:tcMar>
               <w:top w:w="70" w:type="dxa"/>
@@ -2148,7 +3018,7 @@
                 <w:rFonts w:ascii="Calibri" w:hAnsi="Calibri"/>
                 <w:sz w:val="18"/>
               </w:rPr>
-              <w:t>Crear OTs, asignar tareas, auditar la calidad del trabajo realizado y validar el envío a Taxes.com.ar.</w:t>
+              <w:t>Crear OTs, asignar tareas (Preventivo/Correctivo/Herrería), auditar la calidad del trabajo realizado y validar el envío a Taxes.com.ar.</w:t>
             </w:r>
           </w:p>
         </w:tc>
@@ -2156,7 +3026,7 @@
       <w:tr>
         <w:tc>
           <w:tcPr>
-            <w:tcW w:type="dxa" w:w="4680"/>
+            <w:tcW w:type="dxa" w:w="4968"/>
             <w:shd w:fill="FFFFFF"/>
             <w:tcMar>
               <w:top w:w="70" w:type="dxa"/>
@@ -2172,13 +3042,13 @@
                 <w:b/>
                 <w:sz w:val="18"/>
               </w:rPr>
-              <w:t>Sistemista / Robot AI Worker</w:t>
+              <w:t>Asistente IA (Taxes - App Nativa)</w:t>
             </w:r>
           </w:p>
         </w:tc>
         <w:tc>
           <w:tcPr>
-            <w:tcW w:type="dxa" w:w="4680"/>
+            <w:tcW w:type="dxa" w:w="4968"/>
             <w:shd w:fill="FFFFFF"/>
             <w:tcMar>
               <w:top w:w="70" w:type="dxa"/>
@@ -2193,7 +3063,7 @@
                 <w:rFonts w:ascii="Calibri" w:hAnsi="Calibri"/>
                 <w:sz w:val="18"/>
               </w:rPr>
-              <w:t>Garantizar la disponibilidad del Sync Worker Puppeteer, respaldo de base de datos y actualización de Hugo AI.</w:t>
+              <w:t>Garantizar la sincronización automática de OTs con Taxes.com.ar, respaldo de base de datos y actualización de Hugo AI.</w:t>
             </w:r>
           </w:p>
         </w:tc>
@@ -2201,7 +3071,7 @@
       <w:tr>
         <w:tc>
           <w:tcPr>
-            <w:tcW w:type="dxa" w:w="4680"/>
+            <w:tcW w:type="dxa" w:w="4968"/>
             <w:shd w:fill="F8FAFC"/>
             <w:tcMar>
               <w:top w:w="70" w:type="dxa"/>
@@ -2217,13 +3087,13 @@
                 <w:b/>
                 <w:sz w:val="18"/>
               </w:rPr>
-              <w:t>Auditor ISO 9001</w:t>
+              <w:t>Auditor Interno o Taxes - App Nativa IA</w:t>
             </w:r>
           </w:p>
         </w:tc>
         <w:tc>
           <w:tcPr>
-            <w:tcW w:type="dxa" w:w="4680"/>
+            <w:tcW w:type="dxa" w:w="4968"/>
             <w:shd w:fill="F8FAFC"/>
             <w:tcMar>
               <w:top w:w="70" w:type="dxa"/>
@@ -2246,7 +3116,7 @@
     </w:tbl>
     <w:sectPr>
       <w:pgSz w:w="12240" w:h="15840"/>
-      <w:pgMar w:top="1440" w:right="1440" w:bottom="1440" w:left="1440" w:header="720" w:footer="720" w:gutter="0"/>
+      <w:pgMar w:top="1152" w:right="1152" w:bottom="1152" w:left="1152" w:header="720" w:footer="720" w:gutter="0"/>
       <w:cols w:space="720"/>
       <w:docGrid w:linePitch="360"/>
     </w:sectPr>

</xml_diff>

<commit_message>
feat: update Word procedure v3.2 with Chequeador fluids control and Auxilios en ruta
</commit_message>
<xml_diff>
--- a/public/Procedimiento_Mantenimiento_ISO9001.docx
+++ b/public/Procedimiento_Mantenimiento_ISO9001.docx
@@ -29,7 +29,7 @@
           <w:color w:val="475569"/>
           <w:sz w:val="22"/>
         </w:rPr>
-        <w:t>Mantenimiento Preventivo, Correctivo y Herrería de Flota de Vehículos y Maquinarias</w:t>
+        <w:t>Mantenimiento Preventivo, Correctivo, Herrería, Controles de Fluidos y Auxilios en Ruta</w:t>
         <w:br/>
         <w:t>Contenedores Hugo S.A. — Bajo Norma ISO 9001:2015</w:t>
       </w:r>
@@ -147,7 +147,7 @@
                 <w:color w:val="0F172A"/>
                 <w:sz w:val="19"/>
               </w:rPr>
-              <w:t>3.1 (Actualizada)</w:t>
+              <w:t>3.2 (Chequeador &amp; Auxilios)</w:t>
             </w:r>
           </w:p>
         </w:tc>
@@ -303,7 +303,7 @@
           <w:rFonts w:ascii="Calibri" w:hAnsi="Calibri"/>
           <w:sz w:val="21"/>
         </w:rPr>
-        <w:t>Garantizar la disponibilidad operativa, confiabilidad y seguridad de la flota de la empresa mediante un sistema estructurado de mantenimiento preventivo, correctivo y de herrería, asegurando la trazabilidad total de tareas, tiempos, insumos y sincronización oficial bajo los requisitos de la norma ISO 9001:2015.</w:t>
+        <w:t>Garantizar la disponibilidad operativa, confiabilidad y seguridad de la flota de la empresa mediante un sistema estructurado de mantenimiento preventivo, correctivo, de herrería, controles periódicos de fluidos y respuesta rápida ante auxilios mecánicos en ruta, asegurando la trazabilidad total bajo la norma ISO 9001:2015.</w:t>
       </w:r>
     </w:p>
     <w:p>
@@ -330,7 +330,7 @@
           <w:rFonts w:ascii="Calibri" w:hAnsi="Calibri"/>
           <w:sz w:val="21"/>
         </w:rPr>
-        <w:t>Aplica a todas las unidades de la empresa (Camiones, Camionetas, Autos, Auto-elevadores y Maquinarias) y a todo el personal involucrado (Conductores, Choferes, Mecánicos, Supervisores, Jefes de Taller, Asistente IA y Auditores Internos).</w:t>
+        <w:t>Aplica a todas las unidades de la empresa (Camiones, Camionetas, Autos, Auto-elevadores y Maquinarias) y a todo el personal involucrado (Conductores, Choferes, Chequeadores/Inspectores de Fluidos, Mecánicos, Supervisores, Jefes de Taller, Asistente IA y Auditores Internos).</w:t>
       </w:r>
     </w:p>
     <w:p>
@@ -506,7 +506,7 @@
                 <w:rFonts w:ascii="Calibri" w:hAnsi="Calibri"/>
                 <w:sz w:val="18"/>
               </w:rPr>
-              <w:t>Creación de OT, asignación de tareas, cronómetro de mecánicos, estado de unidades, control de calidad y Hugo AI Assistant.</w:t>
+              <w:t>Creación de OT (Preventivo, Correctivo, Herrería, Auxilio), registro de insumos, tiempos, estado de unidades y Hugo AI.</w:t>
             </w:r>
           </w:p>
         </w:tc>
@@ -550,7 +550,7 @@
                 <w:rFonts w:ascii="Calibri" w:hAnsi="Calibri"/>
                 <w:sz w:val="18"/>
               </w:rPr>
-              <w:t>Supervisores, Mecánicos, Jefes de Taller</w:t>
+              <w:t>Supervisores, Mecánicos, Chequeadores, Jefes</w:t>
             </w:r>
           </w:p>
         </w:tc>
@@ -684,7 +684,7 @@
                 <w:rFonts w:ascii="Calibri" w:hAnsi="Calibri"/>
                 <w:sz w:val="18"/>
               </w:rPr>
-              <w:t>Registro instantáneo de novedades desde ruta/choferes y consultas en lenguaje natural.</w:t>
+              <w:t>Registro instantáneo de novedades, chequeo de fluidos, reporte urgente de auxilios en ruta y consultas AI.</w:t>
             </w:r>
           </w:p>
         </w:tc>
@@ -726,7 +726,7 @@
                 <w:rFonts w:ascii="Calibri" w:hAnsi="Calibri"/>
                 <w:sz w:val="18"/>
               </w:rPr>
-              <w:t>Choferes, Mecánicos, Jefes y Supervisores</w:t>
+              <w:t>Choferes, Chequeadores, Mecánicos, Supervisores</w:t>
             </w:r>
           </w:p>
         </w:tc>
@@ -771,7 +771,7 @@
                 <w:rFonts w:ascii="Calibri" w:hAnsi="Calibri"/>
                 <w:sz w:val="18"/>
               </w:rPr>
-              <w:t>Base de datos analítica 2026 para ranking de fallas, historial de preventivos/correctivos, auxilios y combustible.</w:t>
+              <w:t>Base de datos analítica 2026 para ranking de fallas, registro de auxilios en ruta, consumo de combustible e historial.</w:t>
             </w:r>
           </w:p>
         </w:tc>
@@ -984,7 +984,7 @@
                 <w:rFonts w:ascii="Calibri" w:hAnsi="Calibri"/>
                 <w:sz w:val="18"/>
               </w:rPr>
-              <w:t>Plan de mantenimiento preventivo programado según unidad: Kilómetros / Litros de Combustible / Horas de uso por unidad.</w:t>
+              <w:t>Plan de mantenimiento preventivo y Control Diario de Fluidos por Chequeador (Aceite, Refrigerante, Frenos) según Kilómetros / Litros / Horas.</w:t>
             </w:r>
           </w:p>
         </w:tc>
@@ -1050,7 +1050,7 @@
                 <w:rFonts w:ascii="Calibri" w:hAnsi="Calibri"/>
                 <w:sz w:val="18"/>
               </w:rPr>
-              <w:t>Creación obligatoria de OT en la App Nativa con clasificación (Preventivo / Correctivo / Herrería) y responsable asignado.</w:t>
+              <w:t>Creación obligatoria de OT en la App Nativa con clasificación (Preventivo / Correctivo / Herrería / Auxilio en Ruta) y asignación inmediata.</w:t>
             </w:r>
           </w:p>
         </w:tc>
@@ -1116,7 +1116,7 @@
                 <w:rFonts w:ascii="Calibri" w:hAnsi="Calibri"/>
                 <w:sz w:val="18"/>
               </w:rPr>
-              <w:t>Registro de tiempo real (cronómetro), insumos utilizados y validación por Supervisor previo al cierre.</w:t>
+              <w:t>Registro de tiempo real (cronómetro), insumos de auxilio, reposición de fluidos y validación por Supervisor previo al alta.</w:t>
             </w:r>
           </w:p>
         </w:tc>
@@ -1182,7 +1182,7 @@
                 <w:rFonts w:ascii="Calibri" w:hAnsi="Calibri"/>
                 <w:sz w:val="18"/>
               </w:rPr>
-              <w:t>Cambio automático de estado de unidad a ❌ Fuera de Servicio o 🔧 En Reparación vía Chatbot/App.</w:t>
+              <w:t>Cambio automático de estado de unidad a ❌ Fuera de Servicio o 🔧 En Reparación / Auxilio vía Chatbot/App al detectar fallas o fluidos bajos.</w:t>
             </w:r>
           </w:p>
         </w:tc>
@@ -1248,7 +1248,7 @@
                 <w:rFonts w:ascii="Calibri" w:hAnsi="Calibri"/>
                 <w:sz w:val="18"/>
               </w:rPr>
-              <w:t>Sincronización automática a Google Sheets para análisis de KPI (MTBF, MTTR, ranking de fallas).</w:t>
+              <w:t>Sincronización a Google Sheets para análisis de KPI de Auxilios (Frecuencia, Tiempo de Respuesta MTTR, causa raíz).</w:t>
             </w:r>
           </w:p>
         </w:tc>
@@ -1314,7 +1314,7 @@
                 <w:rFonts w:ascii="Calibri" w:hAnsi="Calibri"/>
                 <w:sz w:val="18"/>
               </w:rPr>
-              <w:t>Auditoría automática de inconsistencias y aprendizaje continuo con Hugo AI Assistant.</w:t>
+              <w:t>Auditoría de auxilios recurrentes y aprendizaje continuo con Hugo AI Assistant.</w:t>
             </w:r>
           </w:p>
         </w:tc>
@@ -1465,9 +1465,11 @@
               </w:rPr>
               <w:t>• Chofer / Novedad WhatsApp</w:t>
               <w:br/>
-              <w:t>• Plan de Preventivos Programados</w:t>
+              <w:t>• Control Diario Fluidos (Chequeador)</w:t>
               <w:br/>
-              <w:t>• Solicitud de Herrería</w:t>
+              <w:t>• Auxilio Mecánico en Ruta</w:t>
+              <w:br/>
+              <w:t>• Plan Preventivos / Herrería</w:t>
             </w:r>
           </w:p>
         </w:tc>
@@ -1490,11 +1492,13 @@
               </w:rPr>
               <w:t>1. Registro &amp; Clasificación (App Nativa)</w:t>
               <w:br/>
-              <w:t>2. Ejecución &amp; Tiempos (Mecánicos)</w:t>
+              <w:t>2. Despacho Auxilio / Taller</w:t>
               <w:br/>
-              <w:t>3. Control &amp; Validación (Supervisor)</w:t>
+              <w:t>3. Ejecución &amp; Cronómetro (Mecánicos)</w:t>
               <w:br/>
-              <w:t>4. Sincronización Oficial (Asistente IA)</w:t>
+              <w:t>4. Control &amp; Validación (Supervisor)</w:t>
+              <w:br/>
+              <w:t>5. Sincronización Oficial (Asistente IA)</w:t>
             </w:r>
           </w:p>
         </w:tc>
@@ -1517,7 +1521,7 @@
               </w:rPr>
               <w:t>• Unidad Operativa en Ruta ✅</w:t>
               <w:br/>
-              <w:t>• Google Sheets 2026 (KPI &amp; Rankings)</w:t>
+              <w:t>• Google Sheets 2026 (Pestaña Auxilios &amp; KPI)</w:t>
               <w:br/>
               <w:t>• Asistente Hugo AI (Consultas)</w:t>
             </w:r>
@@ -1541,7 +1545,7 @@
           <w:color w:val="1E3A8A"/>
           <w:sz w:val="23"/>
         </w:rPr>
-        <w:t>4.2 Flujograma Operativo Detallado (Paso a Paso)</w:t>
+        <w:t>4.2 Flujograma Operativo Detallado (Incluye Chequeador y Auxilios)</w:t>
       </w:r>
     </w:p>
     <w:tbl>
@@ -1602,7 +1606,7 @@
                 <w:b/>
                 <w:sz w:val="19"/>
               </w:rPr>
-              <w:t>Detección de Falla, Novedad, Preventivo o Herrería</w:t>
+              <w:t>Detección de Novedad, Fluidos Faltantes, Preventivo, Herrería o Auxilio en Ruta</w:t>
             </w:r>
           </w:p>
         </w:tc>
@@ -1698,7 +1702,7 @@
                 <w:rFonts w:ascii="Calibri" w:hAnsi="Calibri"/>
                 <w:sz w:val="19"/>
               </w:rPr>
-              <w:t>Ruta/Auxilio vía Chatbot WhatsApp  OR  Preventivo/Herrería vía App Nativa</w:t>
+              <w:t>Ruta/Auxilio Urgente vía WhatsApp  OR  Control Fluidos por Chequeador en Playa  OR  Preventivo</w:t>
             </w:r>
           </w:p>
         </w:tc>
@@ -1770,7 +1774,7 @@
                 <w:color w:val="FFFFFF"/>
                 <w:sz w:val="19"/>
               </w:rPr>
-              <w:t>2. REGISTRO</w:t>
+              <w:t>2. DESPACHO &amp; OT</w:t>
             </w:r>
           </w:p>
         </w:tc>
@@ -1794,7 +1798,7 @@
                 <w:rFonts w:ascii="Calibri" w:hAnsi="Calibri"/>
                 <w:sz w:val="19"/>
               </w:rPr>
-              <w:t>Parte de Taller actualiza estado (Fuera de Servicio/Reparación) + Supervisor abre OT</w:t>
+              <w:t>Parte de Taller marca Fuera de Servicio/Reparación/Auxilio + Supervisor crea OT en App Nativa</w:t>
             </w:r>
           </w:p>
         </w:tc>
@@ -1890,7 +1894,7 @@
                 <w:rFonts w:ascii="Calibri" w:hAnsi="Calibri"/>
                 <w:sz w:val="19"/>
               </w:rPr>
-              <w:t>Supervisor asigna Tareas (Preventivo/Correctivo/Herrería), Mecánico e Insumos</w:t>
+              <w:t>Supervisor asigna Tareas (Preventivo/Correctivo/Herrería/Auxilio), Mecánico/Móvil e Insumos</w:t>
             </w:r>
           </w:p>
         </w:tc>
@@ -1986,7 +1990,7 @@
                 <w:rFonts w:ascii="Calibri" w:hAnsi="Calibri"/>
                 <w:sz w:val="19"/>
               </w:rPr>
-              <w:t>Mecánico inicia Cronómetro en App Nativa, ejecuta trabajo y registra insumos</w:t>
+              <w:t>Mecánico o Auxilio Móvil inicia Cronómetro en App Nativa, ejecuta trabajo/rescate y registra repuestos</w:t>
             </w:r>
           </w:p>
         </w:tc>
@@ -2082,7 +2086,7 @@
                 <w:rFonts w:ascii="Calibri" w:hAnsi="Calibri"/>
                 <w:sz w:val="19"/>
               </w:rPr>
-              <w:t>Supervisor / Jefe de Taller realiza Inspección Final y aprueba envío</w:t>
+              <w:t>Supervisor / Jefe de Taller realiza Inspección Final de Calidad y prueba de funcionamiento</w:t>
             </w:r>
           </w:p>
         </w:tc>
@@ -2274,7 +2278,7 @@
                 <w:rFonts w:ascii="Calibri" w:hAnsi="Calibri"/>
                 <w:sz w:val="19"/>
               </w:rPr>
-              <w:t>Auto-archivado a Historial + Exportación a Google Sheets 2026 + Consulta en Hugo AI</w:t>
+              <w:t>Auto-archivado a Historial + Exportación a Google Sheets (Mantenimiento y Auxilios) + Hugo AI</w:t>
             </w:r>
           </w:p>
         </w:tc>
@@ -2371,7 +2375,7 @@
                 <w:b/>
                 <w:sz w:val="19"/>
               </w:rPr>
-              <w:t>Unidad Marcada como ✅ OPERATIVA y lista para servicio</w:t>
+              <w:t>Unidad Marcada como ✅ OPERATIVA y lista para servicio en ruta</w:t>
             </w:r>
           </w:p>
         </w:tc>
@@ -2409,7 +2413,7 @@
           <w:color w:val="1E3A8A"/>
           <w:sz w:val="26"/>
         </w:rPr>
-        <w:t>Etapa 1: Detección y Registro de Novedades</w:t>
+        <w:t>Etapa 1: Inspección de Fluidos y Detección de Novedades</w:t>
       </w:r>
     </w:p>
     <w:p>
@@ -2428,7 +2432,7 @@
           <w:rFonts w:ascii="Calibri" w:hAnsi="Calibri"/>
           <w:sz w:val="20"/>
         </w:rPr>
-        <w:t>El chofer notifica inmediatamente cualquier falla, novedad, auxilio, operatividad o deficiencia vía Chatbot WhatsApp indicando número de interno (#118).</w:t>
+        <w:t>Control de Fluidos por Chequeador: El personal dedicado (Chequeador/Inspector) efectúa revisiones diarias en playa de niveles de aceite, líquido refrigerante, líquido de frenos e inspección visual general.</w:t>
       </w:r>
     </w:p>
     <w:p>
@@ -2447,7 +2451,7 @@
           <w:rFonts w:ascii="Calibri" w:hAnsi="Calibri"/>
           <w:sz w:val="20"/>
         </w:rPr>
-        <w:t>El Chatbot actualiza inmediatamente el Parte de Taller (estado Fuera de Servicio / Reparación).</w:t>
+        <w:t>Novedad o Deficiencia: Si el Chequeador detecta faltantes o anomalías, registra la novedad vía App Nativa o Chatbot.</w:t>
       </w:r>
     </w:p>
     <w:p>
@@ -2466,7 +2470,7 @@
           <w:rFonts w:ascii="Calibri" w:hAnsi="Calibri"/>
           <w:sz w:val="20"/>
         </w:rPr>
-        <w:t>El Supervisor / Jefe de Taller abre la Orden de Trabajo (OT) en la App Nativa.</w:t>
+        <w:t>Auxilios en Ruta: Ante un desperfecto mecánico en servicio, el chofer notifica de inmediato la ubicación y detalles del auxilio vía Chatbot WhatsApp.</w:t>
       </w:r>
     </w:p>
     <w:p>
@@ -2481,7 +2485,7 @@
           <w:color w:val="1E3A8A"/>
           <w:sz w:val="26"/>
         </w:rPr>
-        <w:t>Etapa 2: Planificación y Asignación</w:t>
+        <w:t>Etapa 2: Despacho de Auxilio y Creación de OT</w:t>
       </w:r>
     </w:p>
     <w:p>
@@ -2500,7 +2504,7 @@
           <w:rFonts w:ascii="Calibri" w:hAnsi="Calibri"/>
           <w:sz w:val="20"/>
         </w:rPr>
-        <w:t>Selección de clasificación: Preventivo, Correctivo o Herrería.</w:t>
+        <w:t>El Supervisor activa el Protocolo de Auxilio Mecánico en Ruta y despacha la unidad móvil o mecánico de turno.</w:t>
       </w:r>
     </w:p>
     <w:p>
@@ -2519,7 +2523,22 @@
           <w:rFonts w:ascii="Calibri" w:hAnsi="Calibri"/>
           <w:sz w:val="20"/>
         </w:rPr>
-        <w:t>Asignación de mecánico o especialista responsable (ej: Belocures, César Hernán).</w:t>
+        <w:t>Apertura de Orden de Trabajo (OT) en la App Nativa bajo clasificación: Preventivo, Correctivo, Herrería o Auxilio.</w:t>
+      </w:r>
+    </w:p>
+    <w:p>
+      <w:pPr>
+        <w:keepNext/>
+        <w:spacing w:before="280" w:after="120"/>
+      </w:pPr>
+      <w:r>
+        <w:rPr>
+          <w:rFonts w:ascii="Calibri" w:hAnsi="Calibri"/>
+          <w:b/>
+          <w:color w:val="1E3A8A"/>
+          <w:sz w:val="26"/>
+        </w:rPr>
+        <w:t>Etapa 3: Ejecución de Trabajos y Tiempos de Respuesta</w:t>
       </w:r>
     </w:p>
     <w:p>
@@ -2538,22 +2557,7 @@
           <w:rFonts w:ascii="Calibri" w:hAnsi="Calibri"/>
           <w:sz w:val="20"/>
         </w:rPr>
-        <w:t>Definición de centro de costo, horas estimadas e insumos requeridos.</w:t>
-      </w:r>
-    </w:p>
-    <w:p>
-      <w:pPr>
-        <w:keepNext/>
-        <w:spacing w:before="280" w:after="120"/>
-      </w:pPr>
-      <w:r>
-        <w:rPr>
-          <w:rFonts w:ascii="Calibri" w:hAnsi="Calibri"/>
-          <w:b/>
-          <w:color w:val="1E3A8A"/>
-          <w:sz w:val="26"/>
-        </w:rPr>
-        <w:t>Etapa 3: Ejecución con Medición de Tiempo Real</w:t>
+        <w:t>El mecánico o auxilio móvil opera con tablet/celular desde el taller o lugar del rescate.</w:t>
       </w:r>
     </w:p>
     <w:p>
@@ -2572,7 +2576,7 @@
           <w:rFonts w:ascii="Calibri" w:hAnsi="Calibri"/>
           <w:sz w:val="20"/>
         </w:rPr>
-        <w:t>El mecánico opera con tablet o celular desde el taller.</w:t>
+        <w:t>Mide el tiempo real de reparación activando el cronómetro integrado en la App Nativa.</w:t>
       </w:r>
     </w:p>
     <w:p>
@@ -2591,7 +2595,22 @@
           <w:rFonts w:ascii="Calibri" w:hAnsi="Calibri"/>
           <w:sz w:val="20"/>
         </w:rPr>
-        <w:t>Utiliza el cronómetro integrado en la App Nativa para medir la duración exacta de cada tarea.</w:t>
+        <w:t>Registra repuestos consumidos (correas, mangueras, cubiertas) y fluidos cargados.</w:t>
+      </w:r>
+    </w:p>
+    <w:p>
+      <w:pPr>
+        <w:keepNext/>
+        <w:spacing w:before="280" w:after="120"/>
+      </w:pPr>
+      <w:r>
+        <w:rPr>
+          <w:rFonts w:ascii="Calibri" w:hAnsi="Calibri"/>
+          <w:b/>
+          <w:color w:val="1E3A8A"/>
+          <w:sz w:val="26"/>
+        </w:rPr>
+        <w:t>Etapa 4: Control de Calidad y Retorno Operativo</w:t>
       </w:r>
     </w:p>
     <w:p>
@@ -2610,22 +2629,7 @@
           <w:rFonts w:ascii="Calibri" w:hAnsi="Calibri"/>
           <w:sz w:val="20"/>
         </w:rPr>
-        <w:t>Registra repuestos utilizados e insumos consumidos.</w:t>
-      </w:r>
-    </w:p>
-    <w:p>
-      <w:pPr>
-        <w:keepNext/>
-        <w:spacing w:before="280" w:after="120"/>
-      </w:pPr>
-      <w:r>
-        <w:rPr>
-          <w:rFonts w:ascii="Calibri" w:hAnsi="Calibri"/>
-          <w:b/>
-          <w:color w:val="1E3A8A"/>
-          <w:sz w:val="26"/>
-        </w:rPr>
-        <w:t>Etapa 4: Control de Calidad y Validación</w:t>
+        <w:t>El Supervisor / Jefe de Taller realiza la inspección de cierre del auxilio o reparación.</w:t>
       </w:r>
     </w:p>
     <w:p>
@@ -2644,26 +2648,7 @@
           <w:rFonts w:ascii="Calibri" w:hAnsi="Calibri"/>
           <w:sz w:val="20"/>
         </w:rPr>
-        <w:t>El Supervisor / Jefe de Taller realiza la inspección final.</w:t>
-      </w:r>
-    </w:p>
-    <w:p>
-      <w:pPr>
-        <w:spacing w:after="40"/>
-        <w:ind w:left="360"/>
-      </w:pPr>
-      <w:r>
-        <w:rPr>
-          <w:color w:val="2563EB"/>
-        </w:rPr>
-        <w:t xml:space="preserve">▪ </w:t>
-      </w:r>
-      <w:r>
-        <w:rPr>
-          <w:rFonts w:ascii="Calibri" w:hAnsi="Calibri"/>
-          <w:sz w:val="20"/>
-        </w:rPr>
-        <w:t>Verifica que el 100% de tareas estén en estado 'Finalizada'.</w:t>
+        <w:t>Verifica que el 100% de las tareas estén en estado 'Finalizada'.</w:t>
       </w:r>
     </w:p>
     <w:p>
@@ -2716,7 +2701,7 @@
           <w:rFonts w:ascii="Calibri" w:hAnsi="Calibri"/>
           <w:sz w:val="20"/>
         </w:rPr>
-        <w:t>El ASISTENTE IA (Sync Worker Puppeteer) toma la orden en background.</w:t>
+        <w:t>El ASISTENTE IA (Sync Worker Puppeteer) toma la orden de taller o auxilio en background.</w:t>
       </w:r>
     </w:p>
     <w:p>
@@ -2735,7 +2720,7 @@
           <w:rFonts w:ascii="Calibri" w:hAnsi="Calibri"/>
           <w:sz w:val="20"/>
         </w:rPr>
-        <w:t>Accede a Taxes.com.ar, selecciona Rodado y Responsable sanitizado (sin comas ni typos).</w:t>
+        <w:t>Accede a Taxes.com.ar, selecciona Rodado y Responsable sanitizado.</w:t>
       </w:r>
     </w:p>
     <w:p>
@@ -2788,7 +2773,7 @@
           <w:rFonts w:ascii="Calibri" w:hAnsi="Calibri"/>
           <w:sz w:val="20"/>
         </w:rPr>
-        <w:t>Google Sheets 2026 actualiza indicadores KPI (MTBF, MTTR, ranking de fallas por Kilómetros, Litros y Horas).</w:t>
+        <w:t>Google Sheets 2026 actualiza indicadores KPI (MTBF, MTTR, frecuencia de auxilios por unidad, consumo de fluidos).</w:t>
       </w:r>
     </w:p>
     <w:p>
@@ -2807,7 +2792,7 @@
           <w:rFonts w:ascii="Calibri" w:hAnsi="Calibri"/>
           <w:sz w:val="20"/>
         </w:rPr>
-        <w:t>Hugo AI Assistant disponible 24/7 en la app para responder dudas sobre pendientes, horas trabajadas y mecánicos en lenguaje natural.</w:t>
+        <w:t>Hugo AI Assistant disponible 24/7 en la app para responder dudas sobre auxilios pendientes, horas trabajadas y mecánicos en lenguaje natural.</w:t>
       </w:r>
     </w:p>
     <w:p>
@@ -2952,7 +2937,7 @@
                 <w:b/>
                 <w:sz w:val="18"/>
               </w:rPr>
-              <w:t>Mecánico de Taller</w:t>
+              <w:t>Chequeador / Inspector de Fluidos</w:t>
             </w:r>
           </w:p>
         </w:tc>
@@ -2973,7 +2958,7 @@
                 <w:rFonts w:ascii="Calibri" w:hAnsi="Calibri"/>
                 <w:sz w:val="18"/>
               </w:rPr>
-              <w:t>Registrar inicio/fin de tareas con el cronómetro de la App Nativa, usar insumos correctamente y reportar desvíos.</w:t>
+              <w:t>Realizar control diario de fluidos (aceite, agua, frenos) y estado general en playa; registrar novedades antes del despacho de la unidad.</w:t>
             </w:r>
           </w:p>
         </w:tc>
@@ -2997,7 +2982,7 @@
                 <w:b/>
                 <w:sz w:val="18"/>
               </w:rPr>
-              <w:t>Supervisor / Jefe de Taller</w:t>
+              <w:t>Mecánico / Personal de Auxilio</w:t>
             </w:r>
           </w:p>
         </w:tc>
@@ -3018,7 +3003,7 @@
                 <w:rFonts w:ascii="Calibri" w:hAnsi="Calibri"/>
                 <w:sz w:val="18"/>
               </w:rPr>
-              <w:t>Crear OTs, asignar tareas (Preventivo/Correctivo/Herrería), auditar la calidad del trabajo realizado y validar el envío a Taxes.com.ar.</w:t>
+              <w:t>Acudir al auxilio mecánico en ruta, medir tiempos de reparación con cronómetro App Nativa, usar insumos correctamente y reportar desvíos.</w:t>
             </w:r>
           </w:p>
         </w:tc>
@@ -3042,7 +3027,7 @@
                 <w:b/>
                 <w:sz w:val="18"/>
               </w:rPr>
-              <w:t>Asistente IA (Taxes - App Nativa)</w:t>
+              <w:t>Supervisor / Jefe de Taller</w:t>
             </w:r>
           </w:p>
         </w:tc>
@@ -3063,7 +3048,7 @@
                 <w:rFonts w:ascii="Calibri" w:hAnsi="Calibri"/>
                 <w:sz w:val="18"/>
               </w:rPr>
-              <w:t>Garantizar la sincronización automática de OTs con Taxes.com.ar, respaldo de base de datos y actualización de Hugo AI.</w:t>
+              <w:t>Coordinar el despacho de auxilios, crear OTs (Preventivo/Correctivo/Herrería/Auxilio), auditar calidad del trabajo y validar el alta a Taxes.com.ar.</w:t>
             </w:r>
           </w:p>
         </w:tc>
@@ -3087,7 +3072,7 @@
                 <w:b/>
                 <w:sz w:val="18"/>
               </w:rPr>
-              <w:t>Auditor Interno o Taxes - App Nativa IA</w:t>
+              <w:t>Asistente IA (Taxes - App Nativa)</w:t>
             </w:r>
           </w:p>
         </w:tc>
@@ -3108,7 +3093,52 @@
                 <w:rFonts w:ascii="Calibri" w:hAnsi="Calibri"/>
                 <w:sz w:val="18"/>
               </w:rPr>
-              <w:t>Verificar el cumplimiento del procedimiento, revisión de indicadores KPI mensuales y seguimiento de mejoras.</w:t>
+              <w:t>Garantizar la sincronización automática de OTs de taller y auxilios con Taxes.com.ar, respaldo de base de datos y actualización de Hugo AI.</w:t>
+            </w:r>
+          </w:p>
+        </w:tc>
+      </w:tr>
+      <w:tr>
+        <w:tc>
+          <w:tcPr>
+            <w:tcW w:type="dxa" w:w="4968"/>
+            <w:shd w:fill="FFFFFF"/>
+            <w:tcMar>
+              <w:top w:w="70" w:type="dxa"/>
+              <w:bottom w:w="70" w:type="dxa"/>
+              <w:left w:w="90" w:type="dxa"/>
+              <w:right w:w="90" w:type="dxa"/>
+            </w:tcMar>
+          </w:tcPr>
+          <w:p>
+            <w:r>
+              <w:rPr>
+                <w:rFonts w:ascii="Calibri" w:hAnsi="Calibri"/>
+                <w:b/>
+                <w:sz w:val="18"/>
+              </w:rPr>
+              <w:t>Auditor Interno o Taxes - App Nativa IA</w:t>
+            </w:r>
+          </w:p>
+        </w:tc>
+        <w:tc>
+          <w:tcPr>
+            <w:tcW w:type="dxa" w:w="4968"/>
+            <w:shd w:fill="FFFFFF"/>
+            <w:tcMar>
+              <w:top w:w="70" w:type="dxa"/>
+              <w:bottom w:w="70" w:type="dxa"/>
+              <w:left w:w="90" w:type="dxa"/>
+              <w:right w:w="90" w:type="dxa"/>
+            </w:tcMar>
+          </w:tcPr>
+          <w:p>
+            <w:r>
+              <w:rPr>
+                <w:rFonts w:ascii="Calibri" w:hAnsi="Calibri"/>
+                <w:sz w:val="18"/>
+              </w:rPr>
+              <w:t>Verificar el cumplimiento del procedimiento, seguimiento de KPI de auxilios e indicadores mensuales de falla.</w:t>
             </w:r>
           </w:p>
         </w:tc>

</xml_diff>